<commit_message>
Label paper sources in the notes and expand the sex-difference table
Add screenshot-vs-web-search tags and clickable DOI/PMC links in markdown, DOCX, and PDF. Mark Yan 2019 and Cui 2010 as Cursor web-search fills, not user-provided papers. Expand each cell of the short- vs long-term table with additional primary studies.

Co-authored-by: 36613453226Wallen <36613453226Wallen@users.noreply.github.com>
</commit_message>
<xml_diff>
--- a/收录/睾酮保护原理_文献笔记.docx
+++ b/收录/睾酮保护原理_文献笔记.docx
@@ -144,6 +144,669 @@
           <w:color w:val="1F3A5F"/>
           <w:sz w:val="36"/>
         </w:rPr>
+        <w:t>文献来源标注说明（请先读）</w:t>
+      </w:r>
+    </w:p>
+    <w:p>
+      <w:pPr>
+        <w:spacing w:after="120" w:line="360" w:lineRule="auto"/>
+      </w:pPr>
+      <w:r>
+        <w:rPr>
+          <w:rFonts w:ascii="Calibri" w:hAnsi="Calibri" w:eastAsia="WenQuanYi Micro Hei" w:cs="Calibri"/>
+          <w:b w:val="0"/>
+          <w:i w:val="0"/>
+          <w:color w:val="222222"/>
+          <w:sz w:val="22"/>
+        </w:rPr>
+        <w:t>本收录里每一条论文都会标来源，并给出可点击超链接。标注写在文档正文中，不只在对话里。</w:t>
+      </w:r>
+    </w:p>
+    <w:p>
+      <w:pPr>
+        <w:spacing w:before="320" w:after="160"/>
+      </w:pPr>
+      <w:r>
+        <w:rPr>
+          <w:rFonts w:ascii="Calibri" w:hAnsi="Calibri" w:eastAsia="WenQuanYi Micro Hei" w:cs="Calibri"/>
+          <w:b/>
+          <w:i w:val="0"/>
+          <w:color w:val="1F3A5F"/>
+          <w:sz w:val="32"/>
+        </w:rPr>
+        <w:t>两种来源</w:t>
+      </w:r>
+    </w:p>
+    <w:tbl>
+      <w:tblPr>
+        <w:tblStyle w:val="TableGrid"/>
+        <w:tblW w:type="auto" w:w="0"/>
+        <w:tblLook w:firstColumn="1" w:firstRow="1" w:lastColumn="0" w:lastRow="0" w:noHBand="0" w:noVBand="1" w:val="04A0"/>
+      </w:tblPr>
+      <w:tblGrid>
+        <w:gridCol w:w="3061"/>
+        <w:gridCol w:w="3061"/>
+        <w:gridCol w:w="3061"/>
+      </w:tblGrid>
+      <w:tr>
+        <w:tc>
+          <w:tcPr>
+            <w:tcW w:type="dxa" w:w="3061"/>
+            <w:shd w:fill="1F3A5F" w:val="clear"/>
+          </w:tcPr>
+          <w:p>
+            <w:r/>
+            <w:r>
+              <w:rPr>
+                <w:rFonts w:ascii="Calibri" w:hAnsi="Calibri" w:eastAsia="WenQuanYi Micro Hei" w:cs="Calibri"/>
+                <w:b/>
+                <w:i w:val="0"/>
+                <w:color w:val="FFFFFF"/>
+                <w:sz w:val="18"/>
+              </w:rPr>
+              <w:t>标签</w:t>
+            </w:r>
+          </w:p>
+        </w:tc>
+        <w:tc>
+          <w:tcPr>
+            <w:tcW w:type="dxa" w:w="3061"/>
+            <w:shd w:fill="1F3A5F" w:val="clear"/>
+          </w:tcPr>
+          <w:p>
+            <w:r/>
+            <w:r>
+              <w:rPr>
+                <w:rFonts w:ascii="Calibri" w:hAnsi="Calibri" w:eastAsia="WenQuanYi Micro Hei" w:cs="Calibri"/>
+                <w:b/>
+                <w:i w:val="0"/>
+                <w:color w:val="FFFFFF"/>
+                <w:sz w:val="18"/>
+              </w:rPr>
+              <w:t>含义</w:t>
+            </w:r>
+          </w:p>
+        </w:tc>
+        <w:tc>
+          <w:tcPr>
+            <w:tcW w:type="dxa" w:w="3061"/>
+            <w:shd w:fill="1F3A5F" w:val="clear"/>
+          </w:tcPr>
+          <w:p>
+            <w:r/>
+            <w:r>
+              <w:rPr>
+                <w:rFonts w:ascii="Calibri" w:hAnsi="Calibri" w:eastAsia="WenQuanYi Micro Hei" w:cs="Calibri"/>
+                <w:b/>
+                <w:i w:val="0"/>
+                <w:color w:val="FFFFFF"/>
+                <w:sz w:val="18"/>
+              </w:rPr>
+              <w:t>本任务里有哪些</w:t>
+            </w:r>
+          </w:p>
+        </w:tc>
+      </w:tr>
+      <w:tr>
+        <w:tc>
+          <w:tcPr>
+            <w:tcW w:type="dxa" w:w="3061"/>
+          </w:tcPr>
+          <w:p>
+            <w:r/>
+            <w:r>
+              <w:rPr>
+                <w:rFonts w:ascii="Calibri" w:hAnsi="Calibri" w:eastAsia="WenQuanYi Micro Hei" w:cs="Calibri"/>
+                <w:b/>
+                <w:i w:val="0"/>
+                <w:color w:val="222222"/>
+                <w:sz w:val="18"/>
+              </w:rPr>
+              <w:t>【截图他源】</w:t>
+            </w:r>
+          </w:p>
+        </w:tc>
+        <w:tc>
+          <w:tcPr>
+            <w:tcW w:type="dxa" w:w="3061"/>
+          </w:tcPr>
+          <w:p>
+            <w:r/>
+            <w:r>
+              <w:rPr>
+                <w:rFonts w:ascii="Calibri" w:hAnsi="Calibri" w:eastAsia="WenQuanYi Micro Hei" w:cs="Calibri"/>
+                <w:b w:val="0"/>
+                <w:i w:val="0"/>
+                <w:color w:val="222222"/>
+                <w:sz w:val="18"/>
+              </w:rPr>
+              <w:t>用户截图、粘贴的链接、或提问原文里已经点名的论文</w:t>
+            </w:r>
+          </w:p>
+        </w:tc>
+        <w:tc>
+          <w:tcPr>
+            <w:tcW w:type="dxa" w:w="3061"/>
+          </w:tcPr>
+          <w:p>
+            <w:r/>
+            <w:r>
+              <w:rPr>
+                <w:rFonts w:ascii="Calibri" w:hAnsi="Calibri" w:eastAsia="WenQuanYi Micro Hei" w:cs="Calibri"/>
+                <w:b w:val="0"/>
+                <w:i w:val="0"/>
+                <w:color w:val="222222"/>
+                <w:sz w:val="18"/>
+              </w:rPr>
+              <w:t>只有 1 篇：Savic 2020</w:t>
+            </w:r>
+          </w:p>
+        </w:tc>
+      </w:tr>
+      <w:tr>
+        <w:tc>
+          <w:tcPr>
+            <w:tcW w:type="dxa" w:w="3061"/>
+          </w:tcPr>
+          <w:p>
+            <w:r/>
+            <w:r>
+              <w:rPr>
+                <w:rFonts w:ascii="Calibri" w:hAnsi="Calibri" w:eastAsia="WenQuanYi Micro Hei" w:cs="Calibri"/>
+                <w:b/>
+                <w:i w:val="0"/>
+                <w:color w:val="222222"/>
+                <w:sz w:val="18"/>
+              </w:rPr>
+              <w:t>【Cursor网搜】</w:t>
+            </w:r>
+          </w:p>
+        </w:tc>
+        <w:tc>
+          <w:tcPr>
+            <w:tcW w:type="dxa" w:w="3061"/>
+          </w:tcPr>
+          <w:p>
+            <w:r/>
+            <w:r>
+              <w:rPr>
+                <w:rFonts w:ascii="Calibri" w:hAnsi="Calibri" w:eastAsia="WenQuanYi Micro Hei" w:cs="Calibri"/>
+                <w:b w:val="0"/>
+                <w:i w:val="0"/>
+                <w:color w:val="222222"/>
+                <w:sz w:val="18"/>
+              </w:rPr>
+              <w:t>用户没有点名篇目，由 Cursor 本轮用网络检索补入</w:t>
+            </w:r>
+          </w:p>
+        </w:tc>
+        <w:tc>
+          <w:tcPr>
+            <w:tcW w:type="dxa" w:w="3061"/>
+          </w:tcPr>
+          <w:p>
+            <w:r/>
+            <w:r>
+              <w:rPr>
+                <w:rFonts w:ascii="Calibri" w:hAnsi="Calibri" w:eastAsia="WenQuanYi Micro Hei" w:cs="Calibri"/>
+                <w:b w:val="0"/>
+                <w:i w:val="0"/>
+                <w:color w:val="222222"/>
+                <w:sz w:val="18"/>
+              </w:rPr>
+              <w:t>其余全部，包括填表增补，以及闫旭升 2019、崔慧先 2010</w:t>
+            </w:r>
+          </w:p>
+        </w:tc>
+      </w:tr>
+    </w:tbl>
+    <w:p/>
+    <w:p>
+      <w:pPr>
+        <w:spacing w:after="120" w:line="360" w:lineRule="auto"/>
+      </w:pPr>
+      <w:r>
+        <w:rPr>
+          <w:rFonts w:ascii="Calibri" w:hAnsi="Calibri" w:eastAsia="WenQuanYi Micro Hei" w:cs="Calibri"/>
+          <w:b w:val="0"/>
+          <w:i w:val="0"/>
+          <w:color w:val="222222"/>
+          <w:sz w:val="22"/>
+        </w:rPr>
+        <w:t>用户原提问要求“境外 4 篇 + 大陆境内 2 篇”，但</w:t>
+      </w:r>
+      <w:r>
+        <w:rPr>
+          <w:rFonts w:ascii="Calibri" w:hAnsi="Calibri" w:eastAsia="WenQuanYi Micro Hei" w:cs="Calibri"/>
+          <w:b/>
+          <w:i w:val="0"/>
+          <w:color w:val="222222"/>
+          <w:sz w:val="22"/>
+        </w:rPr>
+        <w:t>没有写出任何境内作者名或题名</w:t>
+      </w:r>
+      <w:r>
+        <w:rPr>
+          <w:rFonts w:ascii="Calibri" w:hAnsi="Calibri" w:eastAsia="WenQuanYi Micro Hei" w:cs="Calibri"/>
+          <w:b w:val="0"/>
+          <w:i w:val="0"/>
+          <w:color w:val="222222"/>
+          <w:sz w:val="22"/>
+        </w:rPr>
+        <w:t>。因此境内两篇是检索补入，不是截图里带来的。</w:t>
+      </w:r>
+    </w:p>
+    <w:p>
+      <w:pPr>
+        <w:spacing w:before="320" w:after="160"/>
+      </w:pPr>
+      <w:r>
+        <w:rPr>
+          <w:rFonts w:ascii="Calibri" w:hAnsi="Calibri" w:eastAsia="WenQuanYi Micro Hei" w:cs="Calibri"/>
+          <w:b/>
+          <w:i w:val="0"/>
+          <w:color w:val="1F3A5F"/>
+          <w:sz w:val="32"/>
+        </w:rPr>
+        <w:t>用户截图 / 提问里实际给出的论文</w:t>
+      </w:r>
+    </w:p>
+    <w:p>
+      <w:pPr>
+        <w:spacing w:after="120" w:line="360" w:lineRule="auto"/>
+        <w:ind w:left="425" w:hanging="227"/>
+      </w:pPr>
+      <w:r>
+        <w:rPr>
+          <w:rFonts w:ascii="Calibri" w:hAnsi="Calibri" w:eastAsia="WenQuanYi Micro Hei" w:cs="Calibri"/>
+          <w:b w:val="0"/>
+          <w:i w:val="0"/>
+          <w:color w:val="222222"/>
+          <w:sz w:val="22"/>
+        </w:rPr>
+        <w:t>•  【截图他源】Savic I. MRS Shows Regionally Increased Glutamate Levels among Patients with Exhaustion Syndrome Due to Occupational Stress. *Cerebral Cortex*. 2020;30(6):3759–3770.</w:t>
+      </w:r>
+    </w:p>
+    <w:p>
+      <w:pPr>
+        <w:spacing w:after="120" w:line="360" w:lineRule="auto"/>
+      </w:pPr>
+      <w:r>
+        <w:rPr>
+          <w:rFonts w:ascii="Calibri" w:hAnsi="Calibri" w:eastAsia="WenQuanYi Micro Hei" w:cs="Calibri"/>
+          <w:b w:val="0"/>
+          <w:i w:val="0"/>
+          <w:color w:val="222222"/>
+          <w:sz w:val="22"/>
+        </w:rPr>
+        <w:t xml:space="preserve">  用户粘贴链接：</w:t>
+      </w:r>
+      <w:hyperlink r:id="rId9">
+        <w:r>
+          <w:rPr>
+            <w:color w:val="1A5F9E"/>
+            <w:u w:val="single"/>
+            <w:sz w:val="22"/>
+            <w:rFonts w:ascii="Calibri" w:hAnsi="Calibri" w:eastAsia="WenQuanYi Micro Hei"/>
+          </w:rPr>
+          <w:t xml:space="preserve">Oxford 全文页</w:t>
+        </w:r>
+      </w:hyperlink>
+      <w:r>
+        <w:rPr>
+          <w:rFonts w:ascii="Calibri" w:hAnsi="Calibri" w:eastAsia="WenQuanYi Micro Hei" w:cs="Calibri"/>
+          <w:b w:val="0"/>
+          <w:i w:val="0"/>
+          <w:color w:val="222222"/>
+          <w:sz w:val="22"/>
+        </w:rPr>
+        <w:t xml:space="preserve"> · </w:t>
+      </w:r>
+      <w:hyperlink r:id="rId10">
+        <w:r>
+          <w:rPr>
+            <w:color w:val="1A5F9E"/>
+            <w:u w:val="single"/>
+            <w:sz w:val="22"/>
+            <w:rFonts w:ascii="Calibri" w:hAnsi="Calibri" w:eastAsia="WenQuanYi Micro Hei"/>
+          </w:rPr>
+          <w:t xml:space="preserve">DOI 10.1093/cercor/bhz340</w:t>
+        </w:r>
+      </w:hyperlink>
+      <w:r>
+        <w:rPr>
+          <w:rFonts w:ascii="Calibri" w:hAnsi="Calibri" w:eastAsia="WenQuanYi Micro Hei" w:cs="Calibri"/>
+          <w:b w:val="0"/>
+          <w:i w:val="0"/>
+          <w:color w:val="222222"/>
+          <w:sz w:val="22"/>
+        </w:rPr>
+        <w:t xml:space="preserve"> · </w:t>
+      </w:r>
+      <w:hyperlink r:id="rId11">
+        <w:r>
+          <w:rPr>
+            <w:color w:val="1A5F9E"/>
+            <w:u w:val="single"/>
+            <w:sz w:val="22"/>
+            <w:rFonts w:ascii="Calibri" w:hAnsi="Calibri" w:eastAsia="WenQuanYi Micro Hei"/>
+          </w:rPr>
+          <w:t xml:space="preserve">PubMed 32195540</w:t>
+        </w:r>
+      </w:hyperlink>
+    </w:p>
+    <w:p>
+      <w:pPr>
+        <w:spacing w:after="120" w:line="360" w:lineRule="auto"/>
+      </w:pPr>
+      <w:r>
+        <w:rPr>
+          <w:rFonts w:ascii="Calibri" w:hAnsi="Calibri" w:eastAsia="WenQuanYi Micro Hei" w:cs="Calibri"/>
+          <w:b w:val="0"/>
+          <w:i w:val="0"/>
+          <w:color w:val="222222"/>
+          <w:sz w:val="22"/>
+        </w:rPr>
+        <w:t>截图里 Grok 还概括了“海马缩小、前额叶变薄、杏仁核可能肥大、睾酮可能有保护”，但</w:t>
+      </w:r>
+      <w:r>
+        <w:rPr>
+          <w:rFonts w:ascii="Calibri" w:hAnsi="Calibri" w:eastAsia="WenQuanYi Micro Hei" w:cs="Calibri"/>
+          <w:b/>
+          <w:i w:val="0"/>
+          <w:color w:val="222222"/>
+          <w:sz w:val="22"/>
+        </w:rPr>
+        <w:t>没有附上那些结论所对应的原始论文链接</w:t>
+      </w:r>
+      <w:r>
+        <w:rPr>
+          <w:rFonts w:ascii="Calibri" w:hAnsi="Calibri" w:eastAsia="WenQuanYi Micro Hei" w:cs="Calibri"/>
+          <w:b w:val="0"/>
+          <w:i w:val="0"/>
+          <w:color w:val="222222"/>
+          <w:sz w:val="22"/>
+        </w:rPr>
+        <w:t>。后面用来填表和做文献笔记的篇目，一律标【Cursor网搜】。</w:t>
+      </w:r>
+    </w:p>
+    <w:p>
+      <w:pPr>
+        <w:spacing w:before="320" w:after="160"/>
+      </w:pPr>
+      <w:r>
+        <w:rPr>
+          <w:rFonts w:ascii="Calibri" w:hAnsi="Calibri" w:eastAsia="WenQuanYi Micro Hei" w:cs="Calibri"/>
+          <w:b/>
+          <w:i w:val="0"/>
+          <w:color w:val="1F3A5F"/>
+          <w:sz w:val="32"/>
+        </w:rPr>
+        <w:t>需要单独点名的两篇境内文献</w:t>
+      </w:r>
+    </w:p>
+    <w:p>
+      <w:pPr>
+        <w:spacing w:after="120" w:line="360" w:lineRule="auto"/>
+      </w:pPr>
+      <w:r>
+        <w:rPr>
+          <w:rFonts w:ascii="Calibri" w:hAnsi="Calibri" w:eastAsia="WenQuanYi Micro Hei" w:cs="Calibri"/>
+          <w:b w:val="0"/>
+          <w:i w:val="0"/>
+          <w:color w:val="222222"/>
+          <w:sz w:val="22"/>
+        </w:rPr>
+        <w:t>这两篇</w:t>
+      </w:r>
+      <w:r>
+        <w:rPr>
+          <w:rFonts w:ascii="Calibri" w:hAnsi="Calibri" w:eastAsia="WenQuanYi Micro Hei" w:cs="Calibri"/>
+          <w:b/>
+          <w:i w:val="0"/>
+          <w:color w:val="222222"/>
+          <w:sz w:val="22"/>
+        </w:rPr>
+        <w:t>不是</w:t>
+      </w:r>
+      <w:r>
+        <w:rPr>
+          <w:rFonts w:ascii="Calibri" w:hAnsi="Calibri" w:eastAsia="WenQuanYi Micro Hei" w:cs="Calibri"/>
+          <w:b w:val="0"/>
+          <w:i w:val="0"/>
+          <w:color w:val="222222"/>
+          <w:sz w:val="22"/>
+        </w:rPr>
+        <w:t>用户提问或截图里原来有的，是 Cursor 为了凑“境内 2 篇”检索补入的：</w:t>
+      </w:r>
+    </w:p>
+    <w:p>
+      <w:pPr>
+        <w:spacing w:after="120" w:line="360" w:lineRule="auto"/>
+        <w:ind w:left="425" w:hanging="227"/>
+      </w:pPr>
+      <w:r>
+        <w:rPr>
+          <w:rFonts w:ascii="Calibri" w:hAnsi="Calibri" w:eastAsia="WenQuanYi Micro Hei" w:cs="Calibri"/>
+          <w:b w:val="0"/>
+          <w:i w:val="0"/>
+          <w:color w:val="222222"/>
+          <w:sz w:val="22"/>
+        </w:rPr>
+        <w:t>•  【Cursor网搜，非截图他源】闫旭升 等. 睾酮对阿尔茨海默病模型大鼠认知功能障碍的保护机制. *神经再生研究*. 2019;14(4):649–657.</w:t>
+      </w:r>
+    </w:p>
+    <w:p>
+      <w:pPr>
+        <w:spacing w:after="120" w:line="360" w:lineRule="auto"/>
+      </w:pPr>
+      <w:r>
+        <w:rPr>
+          <w:rFonts w:ascii="Calibri" w:hAnsi="Calibri" w:eastAsia="WenQuanYi Micro Hei" w:cs="Calibri"/>
+          <w:b w:val="0"/>
+          <w:i w:val="0"/>
+          <w:color w:val="222222"/>
+          <w:sz w:val="22"/>
+        </w:rPr>
+        <w:t xml:space="preserve">   </w:t>
+      </w:r>
+      <w:hyperlink r:id="rId12">
+        <w:r>
+          <w:rPr>
+            <w:color w:val="1A5F9E"/>
+            <w:u w:val="single"/>
+            <w:sz w:val="22"/>
+            <w:rFonts w:ascii="Calibri" w:hAnsi="Calibri" w:eastAsia="WenQuanYi Micro Hei"/>
+          </w:rPr>
+          <w:t xml:space="preserve">DOI 10.4103/1673-5374.245477</w:t>
+        </w:r>
+      </w:hyperlink>
+      <w:r>
+        <w:rPr>
+          <w:rFonts w:ascii="Calibri" w:hAnsi="Calibri" w:eastAsia="WenQuanYi Micro Hei" w:cs="Calibri"/>
+          <w:b w:val="0"/>
+          <w:i w:val="0"/>
+          <w:color w:val="222222"/>
+          <w:sz w:val="22"/>
+        </w:rPr>
+        <w:t xml:space="preserve"> · </w:t>
+      </w:r>
+      <w:hyperlink r:id="rId13">
+        <w:r>
+          <w:rPr>
+            <w:color w:val="1A5F9E"/>
+            <w:u w:val="single"/>
+            <w:sz w:val="22"/>
+            <w:rFonts w:ascii="Calibri" w:hAnsi="Calibri" w:eastAsia="WenQuanYi Micro Hei"/>
+          </w:rPr>
+          <w:t xml:space="preserve">PMC 免费全文</w:t>
+        </w:r>
+      </w:hyperlink>
+      <w:r>
+        <w:rPr>
+          <w:rFonts w:ascii="Calibri" w:hAnsi="Calibri" w:eastAsia="WenQuanYi Micro Hei" w:cs="Calibri"/>
+          <w:b w:val="0"/>
+          <w:i w:val="0"/>
+          <w:color w:val="222222"/>
+          <w:sz w:val="22"/>
+        </w:rPr>
+        <w:t xml:space="preserve"> · </w:t>
+      </w:r>
+      <w:hyperlink r:id="rId14">
+        <w:r>
+          <w:rPr>
+            <w:color w:val="1A5F9E"/>
+            <w:u w:val="single"/>
+            <w:sz w:val="22"/>
+            <w:rFonts w:ascii="Calibri" w:hAnsi="Calibri" w:eastAsia="WenQuanYi Micro Hei"/>
+          </w:rPr>
+          <w:t xml:space="preserve">中国期刊页</w:t>
+        </w:r>
+      </w:hyperlink>
+    </w:p>
+    <w:p>
+      <w:pPr>
+        <w:spacing w:after="120" w:line="360" w:lineRule="auto"/>
+        <w:ind w:left="425" w:hanging="227"/>
+      </w:pPr>
+      <w:r>
+        <w:rPr>
+          <w:rFonts w:ascii="Calibri" w:hAnsi="Calibri" w:eastAsia="WenQuanYi Micro Hei" w:cs="Calibri"/>
+          <w:b w:val="0"/>
+          <w:i w:val="0"/>
+          <w:color w:val="222222"/>
+          <w:sz w:val="22"/>
+        </w:rPr>
+        <w:t>•  【Cursor网搜，非截图他源】崔慧先 等. 双氢睾酮对快速老化小鼠海马 CA1 区突触可塑性和 N-甲基-D-天冬氨酸受体 1 的影响. *解剖学报*. 2010;41(6).</w:t>
+      </w:r>
+    </w:p>
+    <w:p>
+      <w:pPr>
+        <w:spacing w:after="120" w:line="360" w:lineRule="auto"/>
+      </w:pPr>
+      <w:r>
+        <w:rPr>
+          <w:rFonts w:ascii="Calibri" w:hAnsi="Calibri" w:eastAsia="WenQuanYi Micro Hei" w:cs="Calibri"/>
+          <w:b w:val="0"/>
+          <w:i w:val="0"/>
+          <w:color w:val="222222"/>
+          <w:sz w:val="22"/>
+        </w:rPr>
+        <w:t xml:space="preserve">   </w:t>
+      </w:r>
+      <w:hyperlink r:id="rId15">
+        <w:r>
+          <w:rPr>
+            <w:color w:val="1A5F9E"/>
+            <w:u w:val="single"/>
+            <w:sz w:val="22"/>
+            <w:rFonts w:ascii="Calibri" w:hAnsi="Calibri" w:eastAsia="WenQuanYi Micro Hei"/>
+          </w:rPr>
+          <w:t xml:space="preserve">DOI 10.3969/j.issn.0529-1356.2010.06.006</w:t>
+        </w:r>
+      </w:hyperlink>
+    </w:p>
+    <w:p>
+      <w:pPr>
+        <w:spacing w:before="320" w:after="160"/>
+      </w:pPr>
+      <w:r>
+        <w:rPr>
+          <w:rFonts w:ascii="Calibri" w:hAnsi="Calibri" w:eastAsia="WenQuanYi Micro Hei" w:cs="Calibri"/>
+          <w:b/>
+          <w:i w:val="0"/>
+          <w:color w:val="1F3A5F"/>
+          <w:sz w:val="32"/>
+        </w:rPr>
+        <w:t>阅读时怎么用</w:t>
+      </w:r>
+    </w:p>
+    <w:p>
+      <w:pPr>
+        <w:spacing w:after="120" w:line="360" w:lineRule="auto"/>
+        <w:ind w:left="425" w:hanging="227"/>
+      </w:pPr>
+      <w:r>
+        <w:rPr>
+          <w:rFonts w:ascii="Calibri" w:hAnsi="Calibri" w:eastAsia="WenQuanYi Micro Hei" w:cs="Calibri"/>
+          <w:b w:val="0"/>
+          <w:i w:val="0"/>
+          <w:color w:val="222222"/>
+          <w:sz w:val="22"/>
+        </w:rPr>
+        <w:t>•  标签在篇目的「来源标注」行，以及性别差异对照表的每一格里重复出现。</w:t>
+      </w:r>
+    </w:p>
+    <w:p>
+      <w:pPr>
+        <w:spacing w:after="120" w:line="360" w:lineRule="auto"/>
+        <w:ind w:left="425" w:hanging="227"/>
+      </w:pPr>
+      <w:r>
+        <w:rPr>
+          <w:rFonts w:ascii="Calibri" w:hAnsi="Calibri" w:eastAsia="WenQuanYi Micro Hei" w:cs="Calibri"/>
+          <w:b w:val="0"/>
+          <w:i w:val="0"/>
+          <w:color w:val="222222"/>
+          <w:sz w:val="22"/>
+        </w:rPr>
+        <w:t>•  蓝色下划线为超链接（docx / pdf 中可点）。</w:t>
+      </w:r>
+    </w:p>
+    <w:p>
+      <w:pPr>
+        <w:spacing w:after="120" w:line="360" w:lineRule="auto"/>
+        <w:ind w:left="425" w:hanging="227"/>
+      </w:pPr>
+      <w:r>
+        <w:rPr>
+          <w:rFonts w:ascii="Calibri" w:hAnsi="Calibri" w:eastAsia="WenQuanYi Micro Hei" w:cs="Calibri"/>
+          <w:b w:val="0"/>
+          <w:i w:val="0"/>
+          <w:color w:val="222222"/>
+          <w:sz w:val="22"/>
+        </w:rPr>
+        <w:t>•  【截图他源】不等于“更正确”；【Cursor网搜】也不等于“不重要”。标签只说明</w:t>
+      </w:r>
+      <w:r>
+        <w:rPr>
+          <w:rFonts w:ascii="Calibri" w:hAnsi="Calibri" w:eastAsia="WenQuanYi Micro Hei" w:cs="Calibri"/>
+          <w:b/>
+          <w:i w:val="0"/>
+          <w:color w:val="222222"/>
+          <w:sz w:val="22"/>
+        </w:rPr>
+        <w:t>这条文献是谁带进讨论的</w:t>
+      </w:r>
+      <w:r>
+        <w:rPr>
+          <w:rFonts w:ascii="Calibri" w:hAnsi="Calibri" w:eastAsia="WenQuanYi Micro Hei" w:cs="Calibri"/>
+          <w:b w:val="0"/>
+          <w:i w:val="0"/>
+          <w:color w:val="222222"/>
+          <w:sz w:val="22"/>
+        </w:rPr>
+        <w:t>。</w:t>
+      </w:r>
+    </w:p>
+    <w:p>
+      <w:r>
+        <w:br w:type="page"/>
+      </w:r>
+    </w:p>
+    <w:p>
+      <w:pPr>
+        <w:spacing w:before="0" w:after="240" w:line="312" w:lineRule="auto"/>
+        <w:jc w:val="center"/>
+      </w:pPr>
+      <w:r>
+        <w:rPr>
+          <w:rFonts w:ascii="Calibri" w:hAnsi="Calibri" w:eastAsia="WenQuanYi Micro Hei" w:cs="Calibri"/>
+          <w:b/>
+          <w:i w:val="0"/>
+          <w:color w:val="1F3A5F"/>
+          <w:sz w:val="36"/>
+        </w:rPr>
         <w:t>睾酮保护原理：文献笔记（境外 4 篇 + 大陆境内 2 篇）</w:t>
       </w:r>
     </w:p>
@@ -159,7 +822,47 @@
           <w:color w:val="222222"/>
           <w:sz w:val="22"/>
         </w:rPr>
-        <w:t>整理日期：2026-09-20 主题：睾酮（及 DHT、3β-diol）如何在压力 / 糖皮质激素负荷下保护海马与认知，机制分成几条路。 体例：每篇给出出处、简短数据、四点体现分析、主要结论（论点）。 先给一张机制总图，再进入六篇。</w:t>
+        <w:t xml:space="preserve">整理日期：2026-09-20 主题：睾酮（及 DHT、3β-diol）如何在压力 / 糖皮质激素负荷下保护海马与认知，机制分成几条路。 体例：每篇给出出处、来源标注、超链接、简短数据、四点体现分析、主要结论（论点）。 先给一张机制总图，再进入六篇。 </w:t>
+      </w:r>
+      <w:r>
+        <w:rPr>
+          <w:rFonts w:ascii="Calibri" w:hAnsi="Calibri" w:eastAsia="WenQuanYi Micro Hei" w:cs="Calibri"/>
+          <w:b/>
+          <w:i w:val="0"/>
+          <w:color w:val="222222"/>
+          <w:sz w:val="22"/>
+        </w:rPr>
+        <w:t>来源总则：</w:t>
+      </w:r>
+      <w:r>
+        <w:rPr>
+          <w:rFonts w:ascii="Calibri" w:hAnsi="Calibri" w:eastAsia="WenQuanYi Micro Hei" w:cs="Calibri"/>
+          <w:b w:val="0"/>
+          <w:i w:val="0"/>
+          <w:color w:val="222222"/>
+          <w:sz w:val="22"/>
+        </w:rPr>
+        <w:t xml:space="preserve"> 截图里 Grok 只写了“睾酮可能有一定保护作用”，</w:t>
+      </w:r>
+      <w:r>
+        <w:rPr>
+          <w:rFonts w:ascii="Calibri" w:hAnsi="Calibri" w:eastAsia="WenQuanYi Micro Hei" w:cs="Calibri"/>
+          <w:b/>
+          <w:i w:val="0"/>
+          <w:color w:val="222222"/>
+          <w:sz w:val="22"/>
+        </w:rPr>
+        <w:t>没有给出任何睾酮论文</w:t>
+      </w:r>
+      <w:r>
+        <w:rPr>
+          <w:rFonts w:ascii="Calibri" w:hAnsi="Calibri" w:eastAsia="WenQuanYi Micro Hei" w:cs="Calibri"/>
+          <w:b w:val="0"/>
+          <w:i w:val="0"/>
+          <w:color w:val="222222"/>
+          <w:sz w:val="22"/>
+        </w:rPr>
+        <w:t>。本文件 6 篇全部为【Cursor网搜】。境内两篇（闫旭升 2019、崔慧先 2010）尤其需要标明：它们不是用户提问里原来有的篇目。</w:t>
       </w:r>
     </w:p>
     <w:p>
@@ -189,7 +892,27 @@
           <w:color w:val="222222"/>
           <w:sz w:val="22"/>
         </w:rPr>
-        <w:t>睾酮不是“万能防弹衣”，而是一套有条件、多通路的调制：</w:t>
+        <w:t>睾酮不是“万能防弹衣”，而是一套</w:t>
+      </w:r>
+      <w:r>
+        <w:rPr>
+          <w:rFonts w:ascii="Calibri" w:hAnsi="Calibri" w:eastAsia="WenQuanYi Micro Hei" w:cs="Calibri"/>
+          <w:b/>
+          <w:i w:val="0"/>
+          <w:color w:val="222222"/>
+          <w:sz w:val="22"/>
+        </w:rPr>
+        <w:t>有条件、多通路</w:t>
+      </w:r>
+      <w:r>
+        <w:rPr>
+          <w:rFonts w:ascii="Calibri" w:hAnsi="Calibri" w:eastAsia="WenQuanYi Micro Hei" w:cs="Calibri"/>
+          <w:b w:val="0"/>
+          <w:i w:val="0"/>
+          <w:color w:val="222222"/>
+          <w:sz w:val="22"/>
+        </w:rPr>
+        <w:t>的调制：</w:t>
       </w:r>
     </w:p>
     <w:p>
@@ -205,7 +928,47 @@
           <w:color w:val="222222"/>
           <w:sz w:val="22"/>
         </w:rPr>
-        <w:t>•  **压低 HPA 轴峰值：** 睾酮 → 5α-还原成 DHT → 再变成 3β-diol → 作用于下丘脑室旁核附近的 **ERβ**，减少应激后 ACTH / 皮质酮。这条路不完全依赖雄激素受体（AR）。</w:t>
+        <w:t xml:space="preserve">•  </w:t>
+      </w:r>
+      <w:r>
+        <w:rPr>
+          <w:rFonts w:ascii="Calibri" w:hAnsi="Calibri" w:eastAsia="WenQuanYi Micro Hei" w:cs="Calibri"/>
+          <w:b/>
+          <w:i w:val="0"/>
+          <w:color w:val="222222"/>
+          <w:sz w:val="22"/>
+        </w:rPr>
+        <w:t>压低 HPA 轴峰值：</w:t>
+      </w:r>
+      <w:r>
+        <w:rPr>
+          <w:rFonts w:ascii="Calibri" w:hAnsi="Calibri" w:eastAsia="WenQuanYi Micro Hei" w:cs="Calibri"/>
+          <w:b w:val="0"/>
+          <w:i w:val="0"/>
+          <w:color w:val="222222"/>
+          <w:sz w:val="22"/>
+        </w:rPr>
+        <w:t xml:space="preserve"> 睾酮 → 5α-还原成 DHT → 再变成 3β-diol → 作用于下丘脑室旁核附近的 </w:t>
+      </w:r>
+      <w:r>
+        <w:rPr>
+          <w:rFonts w:ascii="Calibri" w:hAnsi="Calibri" w:eastAsia="WenQuanYi Micro Hei" w:cs="Calibri"/>
+          <w:b/>
+          <w:i w:val="0"/>
+          <w:color w:val="222222"/>
+          <w:sz w:val="22"/>
+        </w:rPr>
+        <w:t>ERβ</w:t>
+      </w:r>
+      <w:r>
+        <w:rPr>
+          <w:rFonts w:ascii="Calibri" w:hAnsi="Calibri" w:eastAsia="WenQuanYi Micro Hei" w:cs="Calibri"/>
+          <w:b w:val="0"/>
+          <w:i w:val="0"/>
+          <w:color w:val="222222"/>
+          <w:sz w:val="22"/>
+        </w:rPr>
+        <w:t>，减少应激后 ACTH / 皮质酮。这条路不完全依赖雄激素受体（AR）。</w:t>
       </w:r>
     </w:p>
     <w:p>
@@ -221,7 +984,27 @@
           <w:color w:val="222222"/>
           <w:sz w:val="22"/>
         </w:rPr>
-        <w:t>•  **和糖皮质激素受体互相踩刹车：** AR 与 GR 可形成异源二聚体，转录上互相抑制；DHT 还可下调海马 CA1 的 GR mRNA。高皮质醇时，有足够睾酮就像给分解代谢配了对冲。</w:t>
+        <w:t xml:space="preserve">•  </w:t>
+      </w:r>
+      <w:r>
+        <w:rPr>
+          <w:rFonts w:ascii="Calibri" w:hAnsi="Calibri" w:eastAsia="WenQuanYi Micro Hei" w:cs="Calibri"/>
+          <w:b/>
+          <w:i w:val="0"/>
+          <w:color w:val="222222"/>
+          <w:sz w:val="22"/>
+        </w:rPr>
+        <w:t>和糖皮质激素受体互相踩刹车：</w:t>
+      </w:r>
+      <w:r>
+        <w:rPr>
+          <w:rFonts w:ascii="Calibri" w:hAnsi="Calibri" w:eastAsia="WenQuanYi Micro Hei" w:cs="Calibri"/>
+          <w:b w:val="0"/>
+          <w:i w:val="0"/>
+          <w:color w:val="222222"/>
+          <w:sz w:val="22"/>
+        </w:rPr>
+        <w:t xml:space="preserve"> AR 与 GR 可形成异源二聚体，转录上互相抑制；DHT 还可下调海马 CA1 的 GR mRNA。高皮质醇时，有足够睾酮就像给分解代谢配了对冲。</w:t>
       </w:r>
     </w:p>
     <w:p>
@@ -237,7 +1020,27 @@
           <w:color w:val="222222"/>
           <w:sz w:val="22"/>
         </w:rPr>
-        <w:t>•  **保突触、保新神经元：** 经 AR 或经 Erk1/2–CREB：增加树突棘、PSD95、GluA1，提高齿状回新生神经元存活。</w:t>
+        <w:t xml:space="preserve">•  </w:t>
+      </w:r>
+      <w:r>
+        <w:rPr>
+          <w:rFonts w:ascii="Calibri" w:hAnsi="Calibri" w:eastAsia="WenQuanYi Micro Hei" w:cs="Calibri"/>
+          <w:b/>
+          <w:i w:val="0"/>
+          <w:color w:val="222222"/>
+          <w:sz w:val="22"/>
+        </w:rPr>
+        <w:t>保突触、保新神经元：</w:t>
+      </w:r>
+      <w:r>
+        <w:rPr>
+          <w:rFonts w:ascii="Calibri" w:hAnsi="Calibri" w:eastAsia="WenQuanYi Micro Hei" w:cs="Calibri"/>
+          <w:b w:val="0"/>
+          <w:i w:val="0"/>
+          <w:color w:val="222222"/>
+          <w:sz w:val="22"/>
+        </w:rPr>
+        <w:t xml:space="preserve"> 经 AR 或经 Erk1/2–CREB：增加树突棘、PSD95、GluA1，提高齿状回新生神经元存活。</w:t>
       </w:r>
     </w:p>
     <w:p>
@@ -253,7 +1056,27 @@
           <w:color w:val="222222"/>
           <w:sz w:val="22"/>
         </w:rPr>
-        <w:t>•  **抗氧化：** 经 AR：提高 SOD、GSH-Px，降低 MDA，减少自由基对突触的刮擦。</w:t>
+        <w:t xml:space="preserve">•  </w:t>
+      </w:r>
+      <w:r>
+        <w:rPr>
+          <w:rFonts w:ascii="Calibri" w:hAnsi="Calibri" w:eastAsia="WenQuanYi Micro Hei" w:cs="Calibri"/>
+          <w:b/>
+          <w:i w:val="0"/>
+          <w:color w:val="222222"/>
+          <w:sz w:val="22"/>
+        </w:rPr>
+        <w:t>抗氧化：</w:t>
+      </w:r>
+      <w:r>
+        <w:rPr>
+          <w:rFonts w:ascii="Calibri" w:hAnsi="Calibri" w:eastAsia="WenQuanYi Micro Hei" w:cs="Calibri"/>
+          <w:b w:val="0"/>
+          <w:i w:val="0"/>
+          <w:color w:val="222222"/>
+          <w:sz w:val="22"/>
+        </w:rPr>
+        <w:t xml:space="preserve"> 经 AR：提高 SOD、GSH-Px，降低 MDA，减少自由基对突触的刮擦。</w:t>
       </w:r>
     </w:p>
     <w:p>
@@ -269,7 +1092,27 @@
           <w:color w:val="222222"/>
           <w:sz w:val="22"/>
         </w:rPr>
-        <w:t>•  **条件性：** 人身上看到：皮质醇高时，睾酮高 ↔ 海马更大、情景记忆更好；皮质醇低时，这个关系可以反号。所以“补得越多越保护”不成立。</w:t>
+        <w:t xml:space="preserve">•  </w:t>
+      </w:r>
+      <w:r>
+        <w:rPr>
+          <w:rFonts w:ascii="Calibri" w:hAnsi="Calibri" w:eastAsia="WenQuanYi Micro Hei" w:cs="Calibri"/>
+          <w:b/>
+          <w:i w:val="0"/>
+          <w:color w:val="222222"/>
+          <w:sz w:val="22"/>
+        </w:rPr>
+        <w:t>条件性：</w:t>
+      </w:r>
+      <w:r>
+        <w:rPr>
+          <w:rFonts w:ascii="Calibri" w:hAnsi="Calibri" w:eastAsia="WenQuanYi Micro Hei" w:cs="Calibri"/>
+          <w:b w:val="0"/>
+          <w:i w:val="0"/>
+          <w:color w:val="222222"/>
+          <w:sz w:val="22"/>
+        </w:rPr>
+        <w:t xml:space="preserve"> 人身上看到：皮质醇高时，睾酮高 ↔ 海马更大、情景记忆更好；皮质醇低时，这个关系可以反号。所以“补得越多越保护”不成立。</w:t>
       </w:r>
     </w:p>
     <w:p>
@@ -309,12 +1152,125 @@
       <w:r>
         <w:rPr>
           <w:rFonts w:ascii="Calibri" w:hAnsi="Calibri" w:eastAsia="WenQuanYi Micro Hei" w:cs="Calibri"/>
+          <w:b/>
+          <w:i w:val="0"/>
+          <w:color w:val="222222"/>
+          <w:sz w:val="22"/>
+        </w:rPr>
+        <w:t>出处</w:t>
+      </w:r>
+      <w:r>
+        <w:rPr>
+          <w:rFonts w:ascii="Calibri" w:hAnsi="Calibri" w:eastAsia="WenQuanYi Micro Hei" w:cs="Calibri"/>
           <w:b w:val="0"/>
           <w:i w:val="0"/>
           <w:color w:val="222222"/>
           <w:sz w:val="22"/>
         </w:rPr>
-        <w:t>出处 Lund TD, Hinds LR, Handa RJ. The androgen 5α-dihydrotestosterone and its metabolite 5α-androstan-3β,17β-diol inhibit the hypothalamo–pituitary–adrenal response to stress by acting through estrogen receptor β-expressing neurons in the hypothalamus. *Journal of Neuroscience*. 2006;26(5):1448–1456. DOI：10.1523/JNEUROSCI.3777-05.2006 PMID：16452668 单位：科罗拉多州立大学等。 类型：去势雄鼠，室旁核附近埋植激素。</w:t>
+        <w:t xml:space="preserve"> Lund TD, Hinds LR, Handa RJ. The androgen 5α-dihydrotestosterone and its metabolite 5α-androstan-3β,17β-diol inhibit the hypothalamo–pituitary–adrenal response to stress by acting through estrogen receptor β-expressing neurons in the hypothalamus. *Journal of Neuroscience*. 2006;26(5):1448–1456. </w:t>
+      </w:r>
+      <w:r>
+        <w:rPr>
+          <w:rFonts w:ascii="Calibri" w:hAnsi="Calibri" w:eastAsia="WenQuanYi Micro Hei" w:cs="Calibri"/>
+          <w:b/>
+          <w:i w:val="0"/>
+          <w:color w:val="222222"/>
+          <w:sz w:val="22"/>
+        </w:rPr>
+        <w:t>来源标注：</w:t>
+      </w:r>
+      <w:r>
+        <w:rPr>
+          <w:rFonts w:ascii="Calibri" w:hAnsi="Calibri" w:eastAsia="WenQuanYi Micro Hei" w:cs="Calibri"/>
+          <w:b w:val="0"/>
+          <w:i w:val="0"/>
+          <w:color w:val="222222"/>
+          <w:sz w:val="22"/>
+        </w:rPr>
+        <w:t xml:space="preserve">【Cursor网搜】用户截图只提到“睾酮可能有保护”，未点名本篇。 </w:t>
+      </w:r>
+      <w:r>
+        <w:rPr>
+          <w:rFonts w:ascii="Calibri" w:hAnsi="Calibri" w:eastAsia="WenQuanYi Micro Hei" w:cs="Calibri"/>
+          <w:b/>
+          <w:i w:val="0"/>
+          <w:color w:val="222222"/>
+          <w:sz w:val="22"/>
+        </w:rPr>
+        <w:t>超链接：</w:t>
+      </w:r>
+      <w:r>
+        <w:rPr>
+          <w:rFonts w:ascii="Calibri" w:hAnsi="Calibri" w:eastAsia="WenQuanYi Micro Hei" w:cs="Calibri"/>
+          <w:b w:val="0"/>
+          <w:i w:val="0"/>
+          <w:color w:val="222222"/>
+          <w:sz w:val="22"/>
+        </w:rPr>
+        <w:t xml:space="preserve"> </w:t>
+      </w:r>
+      <w:hyperlink r:id="rId16">
+        <w:r>
+          <w:rPr>
+            <w:color w:val="1A5F9E"/>
+            <w:u w:val="single"/>
+            <w:sz w:val="22"/>
+            <w:rFonts w:ascii="Calibri" w:hAnsi="Calibri" w:eastAsia="WenQuanYi Micro Hei"/>
+          </w:rPr>
+          <w:t xml:space="preserve">DOI 10.1523/JNEUROSCI.3777-05.2006</w:t>
+        </w:r>
+      </w:hyperlink>
+      <w:r>
+        <w:rPr>
+          <w:rFonts w:ascii="Calibri" w:hAnsi="Calibri" w:eastAsia="WenQuanYi Micro Hei" w:cs="Calibri"/>
+          <w:b w:val="0"/>
+          <w:i w:val="0"/>
+          <w:color w:val="222222"/>
+          <w:sz w:val="22"/>
+        </w:rPr>
+        <w:t xml:space="preserve"> · </w:t>
+      </w:r>
+      <w:hyperlink r:id="rId17">
+        <w:r>
+          <w:rPr>
+            <w:color w:val="1A5F9E"/>
+            <w:u w:val="single"/>
+            <w:sz w:val="22"/>
+            <w:rFonts w:ascii="Calibri" w:hAnsi="Calibri" w:eastAsia="WenQuanYi Micro Hei"/>
+          </w:rPr>
+          <w:t xml:space="preserve">PMC 6675494</w:t>
+        </w:r>
+      </w:hyperlink>
+      <w:r>
+        <w:rPr>
+          <w:rFonts w:ascii="Calibri" w:hAnsi="Calibri" w:eastAsia="WenQuanYi Micro Hei" w:cs="Calibri"/>
+          <w:b w:val="0"/>
+          <w:i w:val="0"/>
+          <w:color w:val="222222"/>
+          <w:sz w:val="22"/>
+        </w:rPr>
+        <w:t xml:space="preserve"> · </w:t>
+      </w:r>
+      <w:hyperlink r:id="rId18">
+        <w:r>
+          <w:rPr>
+            <w:color w:val="1A5F9E"/>
+            <w:u w:val="single"/>
+            <w:sz w:val="22"/>
+            <w:rFonts w:ascii="Calibri" w:hAnsi="Calibri" w:eastAsia="WenQuanYi Micro Hei"/>
+          </w:rPr>
+          <w:t xml:space="preserve">PubMed 16452668</w:t>
+        </w:r>
+      </w:hyperlink>
+      <w:r>
+        <w:rPr>
+          <w:rFonts w:ascii="Calibri" w:hAnsi="Calibri" w:eastAsia="WenQuanYi Micro Hei" w:cs="Calibri"/>
+          <w:b w:val="0"/>
+          <w:i w:val="0"/>
+          <w:color w:val="222222"/>
+          <w:sz w:val="22"/>
+        </w:rPr>
+        <w:t xml:space="preserve"> 单位：科罗拉多州立大学等。 类型：去势雄鼠，室旁核附近埋植激素。</w:t>
       </w:r>
     </w:p>
     <w:p>
@@ -324,7 +1280,7 @@
       <w:r>
         <w:rPr>
           <w:rFonts w:ascii="Calibri" w:hAnsi="Calibri" w:eastAsia="WenQuanYi Micro Hei" w:cs="Calibri"/>
-          <w:b w:val="0"/>
+          <w:b/>
           <w:i w:val="0"/>
           <w:color w:val="222222"/>
           <w:sz w:val="22"/>
@@ -361,7 +1317,27 @@
           <w:color w:val="222222"/>
           <w:sz w:val="22"/>
         </w:rPr>
-        <w:t>•  E2 及 ERα 激动剂（moxestrol、PPT）**升高**束缚后皮质酮和 ACTH。</w:t>
+        <w:t>•  E2 及 ERα 激动剂（moxestrol、PPT）</w:t>
+      </w:r>
+      <w:r>
+        <w:rPr>
+          <w:rFonts w:ascii="Calibri" w:hAnsi="Calibri" w:eastAsia="WenQuanYi Micro Hei" w:cs="Calibri"/>
+          <w:b/>
+          <w:i w:val="0"/>
+          <w:color w:val="222222"/>
+          <w:sz w:val="22"/>
+        </w:rPr>
+        <w:t>升高</w:t>
+      </w:r>
+      <w:r>
+        <w:rPr>
+          <w:rFonts w:ascii="Calibri" w:hAnsi="Calibri" w:eastAsia="WenQuanYi Micro Hei" w:cs="Calibri"/>
+          <w:b w:val="0"/>
+          <w:i w:val="0"/>
+          <w:color w:val="222222"/>
+          <w:sz w:val="22"/>
+        </w:rPr>
+        <w:t>束缚后皮质酮和 ACTH。</w:t>
       </w:r>
     </w:p>
     <w:p>
@@ -377,7 +1353,27 @@
           <w:color w:val="222222"/>
           <w:sz w:val="22"/>
         </w:rPr>
-        <w:t>•  DHT、3β-diol 及 ERβ 激动剂 DPN **降低**束缚后皮质酮和 ACTH，并降低 PVN 的 c-fos mRNA。</w:t>
+        <w:t xml:space="preserve">•  DHT、3β-diol 及 ERβ 激动剂 DPN </w:t>
+      </w:r>
+      <w:r>
+        <w:rPr>
+          <w:rFonts w:ascii="Calibri" w:hAnsi="Calibri" w:eastAsia="WenQuanYi Micro Hei" w:cs="Calibri"/>
+          <w:b/>
+          <w:i w:val="0"/>
+          <w:color w:val="222222"/>
+          <w:sz w:val="22"/>
+        </w:rPr>
+        <w:t>降低</w:t>
+      </w:r>
+      <w:r>
+        <w:rPr>
+          <w:rFonts w:ascii="Calibri" w:hAnsi="Calibri" w:eastAsia="WenQuanYi Micro Hei" w:cs="Calibri"/>
+          <w:b w:val="0"/>
+          <w:i w:val="0"/>
+          <w:color w:val="222222"/>
+          <w:sz w:val="22"/>
+        </w:rPr>
+        <w:t>束缚后皮质酮和 ACTH，并降低 PVN 的 c-fos mRNA。</w:t>
       </w:r>
     </w:p>
     <w:p>
@@ -403,7 +1399,7 @@
       <w:r>
         <w:rPr>
           <w:rFonts w:ascii="Calibri" w:hAnsi="Calibri" w:eastAsia="WenQuanYi Micro Hei" w:cs="Calibri"/>
-          <w:b w:val="0"/>
+          <w:b/>
           <w:i w:val="0"/>
           <w:color w:val="222222"/>
           <w:sz w:val="22"/>
@@ -424,7 +1420,27 @@
           <w:color w:val="222222"/>
           <w:sz w:val="22"/>
         </w:rPr>
-        <w:t>•  **保护的第一刀砍在“少分泌糖皮质激素”**，不是等海马受伤再修。</w:t>
+        <w:t xml:space="preserve">•  </w:t>
+      </w:r>
+      <w:r>
+        <w:rPr>
+          <w:rFonts w:ascii="Calibri" w:hAnsi="Calibri" w:eastAsia="WenQuanYi Micro Hei" w:cs="Calibri"/>
+          <w:b/>
+          <w:i w:val="0"/>
+          <w:color w:val="222222"/>
+          <w:sz w:val="22"/>
+        </w:rPr>
+        <w:t>保护的第一刀砍在“少分泌糖皮质激素”</w:t>
+      </w:r>
+      <w:r>
+        <w:rPr>
+          <w:rFonts w:ascii="Calibri" w:hAnsi="Calibri" w:eastAsia="WenQuanYi Micro Hei" w:cs="Calibri"/>
+          <w:b w:val="0"/>
+          <w:i w:val="0"/>
+          <w:color w:val="222222"/>
+          <w:sz w:val="22"/>
+        </w:rPr>
+        <w:t>，不是等海马受伤再修。</w:t>
       </w:r>
     </w:p>
     <w:p>
@@ -440,7 +1456,27 @@
           <w:color w:val="222222"/>
           <w:sz w:val="22"/>
         </w:rPr>
-        <w:t>•  **DHT 的抗应激效应很大一块要走代谢物 3β-diol → ERβ**，不是课本上那条“雄激素只绑 AR”。</w:t>
+        <w:t xml:space="preserve">•  </w:t>
+      </w:r>
+      <w:r>
+        <w:rPr>
+          <w:rFonts w:ascii="Calibri" w:hAnsi="Calibri" w:eastAsia="WenQuanYi Micro Hei" w:cs="Calibri"/>
+          <w:b/>
+          <w:i w:val="0"/>
+          <w:color w:val="222222"/>
+          <w:sz w:val="22"/>
+        </w:rPr>
+        <w:t>DHT 的抗应激效应很大一块要走代谢物 3β-diol → ERβ</w:t>
+      </w:r>
+      <w:r>
+        <w:rPr>
+          <w:rFonts w:ascii="Calibri" w:hAnsi="Calibri" w:eastAsia="WenQuanYi Micro Hei" w:cs="Calibri"/>
+          <w:b w:val="0"/>
+          <w:i w:val="0"/>
+          <w:color w:val="222222"/>
+          <w:sz w:val="22"/>
+        </w:rPr>
+        <w:t>，不是课本上那条“雄激素只绑 AR”。</w:t>
       </w:r>
     </w:p>
     <w:p>
@@ -456,7 +1492,27 @@
           <w:color w:val="222222"/>
           <w:sz w:val="22"/>
         </w:rPr>
-        <w:t>•  **同一类“雌激素相关”信号可以方向相反**：ERα 放大 HPA，ERβ 压低 HPA。</w:t>
+        <w:t xml:space="preserve">•  </w:t>
+      </w:r>
+      <w:r>
+        <w:rPr>
+          <w:rFonts w:ascii="Calibri" w:hAnsi="Calibri" w:eastAsia="WenQuanYi Micro Hei" w:cs="Calibri"/>
+          <w:b/>
+          <w:i w:val="0"/>
+          <w:color w:val="222222"/>
+          <w:sz w:val="22"/>
+        </w:rPr>
+        <w:t>同一类“雌激素相关”信号可以方向相反</w:t>
+      </w:r>
+      <w:r>
+        <w:rPr>
+          <w:rFonts w:ascii="Calibri" w:hAnsi="Calibri" w:eastAsia="WenQuanYi Micro Hei" w:cs="Calibri"/>
+          <w:b w:val="0"/>
+          <w:i w:val="0"/>
+          <w:color w:val="222222"/>
+          <w:sz w:val="22"/>
+        </w:rPr>
+        <w:t>：ERα 放大 HPA，ERβ 压低 HPA。</w:t>
       </w:r>
     </w:p>
     <w:p>
@@ -472,7 +1528,27 @@
           <w:color w:val="222222"/>
           <w:sz w:val="22"/>
         </w:rPr>
-        <w:t>•  **这解释了性别差的一部分**：雄性有更多底物走 DHT / 3β-diol 这条刹车。</w:t>
+        <w:t xml:space="preserve">•  </w:t>
+      </w:r>
+      <w:r>
+        <w:rPr>
+          <w:rFonts w:ascii="Calibri" w:hAnsi="Calibri" w:eastAsia="WenQuanYi Micro Hei" w:cs="Calibri"/>
+          <w:b/>
+          <w:i w:val="0"/>
+          <w:color w:val="222222"/>
+          <w:sz w:val="22"/>
+        </w:rPr>
+        <w:t>这解释了性别差的一部分</w:t>
+      </w:r>
+      <w:r>
+        <w:rPr>
+          <w:rFonts w:ascii="Calibri" w:hAnsi="Calibri" w:eastAsia="WenQuanYi Micro Hei" w:cs="Calibri"/>
+          <w:b w:val="0"/>
+          <w:i w:val="0"/>
+          <w:color w:val="222222"/>
+          <w:sz w:val="22"/>
+        </w:rPr>
+        <w:t>：雄性有更多底物走 DHT / 3β-diol 这条刹车。</w:t>
       </w:r>
     </w:p>
     <w:p>
@@ -482,12 +1558,22 @@
       <w:r>
         <w:rPr>
           <w:rFonts w:ascii="Calibri" w:hAnsi="Calibri" w:eastAsia="WenQuanYi Micro Hei" w:cs="Calibri"/>
+          <w:b/>
+          <w:i w:val="0"/>
+          <w:color w:val="222222"/>
+          <w:sz w:val="22"/>
+        </w:rPr>
+        <w:t>主要结论（论点）</w:t>
+      </w:r>
+      <w:r>
+        <w:rPr>
+          <w:rFonts w:ascii="Calibri" w:hAnsi="Calibri" w:eastAsia="WenQuanYi Micro Hei" w:cs="Calibri"/>
           <w:b w:val="0"/>
           <w:i w:val="0"/>
           <w:color w:val="222222"/>
           <w:sz w:val="22"/>
         </w:rPr>
-        <w:t>主要结论（论点） 睾酮经 DHT → 3β-diol 激活下丘脑 ERβ 神经元，抑制应激性 HPA 反应；这是雄激素保护的中枢入口之一。</w:t>
+        <w:t xml:space="preserve"> 睾酮经 DHT → 3β-diol 激活下丘脑 ERβ 神经元，抑制应激性 HPA 反应；这是雄激素保护的中枢入口之一。</w:t>
       </w:r>
     </w:p>
     <w:p>
@@ -512,12 +1598,104 @@
       <w:r>
         <w:rPr>
           <w:rFonts w:ascii="Calibri" w:hAnsi="Calibri" w:eastAsia="WenQuanYi Micro Hei" w:cs="Calibri"/>
+          <w:b/>
+          <w:i w:val="0"/>
+          <w:color w:val="222222"/>
+          <w:sz w:val="22"/>
+        </w:rPr>
+        <w:t>出处</w:t>
+      </w:r>
+      <w:r>
+        <w:rPr>
+          <w:rFonts w:ascii="Calibri" w:hAnsi="Calibri" w:eastAsia="WenQuanYi Micro Hei" w:cs="Calibri"/>
           <w:b w:val="0"/>
           <w:i w:val="0"/>
           <w:color w:val="222222"/>
           <w:sz w:val="22"/>
         </w:rPr>
-        <w:t>出处 Spritzer MD, Galea LAM. Testosterone and dihydrotestosterone, but not estradiol, enhance survival of new hippocampal neurons in adult male rats. *Developmental Neurobiology*. 2007;67(10):1321–1333. DOI：10.1002/dneu.20457 PMID：17638384 单位：不列颠哥伦比亚大学。 类型：成体雄鼠神经发生。</w:t>
+        <w:t xml:space="preserve"> Spritzer MD, Galea LAM. Testosterone and dihydrotestosterone, but not estradiol, enhance survival of new hippocampal neurons in adult male rats. *Developmental Neurobiology*. 2007;67(10):1321–1333. </w:t>
+      </w:r>
+      <w:r>
+        <w:rPr>
+          <w:rFonts w:ascii="Calibri" w:hAnsi="Calibri" w:eastAsia="WenQuanYi Micro Hei" w:cs="Calibri"/>
+          <w:b/>
+          <w:i w:val="0"/>
+          <w:color w:val="222222"/>
+          <w:sz w:val="22"/>
+        </w:rPr>
+        <w:t>来源标注：</w:t>
+      </w:r>
+      <w:r>
+        <w:rPr>
+          <w:rFonts w:ascii="Calibri" w:hAnsi="Calibri" w:eastAsia="WenQuanYi Micro Hei" w:cs="Calibri"/>
+          <w:b w:val="0"/>
+          <w:i w:val="0"/>
+          <w:color w:val="222222"/>
+          <w:sz w:val="22"/>
+        </w:rPr>
+        <w:t xml:space="preserve">【Cursor网搜】用户截图 / 提问未点名本篇。 </w:t>
+      </w:r>
+      <w:r>
+        <w:rPr>
+          <w:rFonts w:ascii="Calibri" w:hAnsi="Calibri" w:eastAsia="WenQuanYi Micro Hei" w:cs="Calibri"/>
+          <w:b/>
+          <w:i w:val="0"/>
+          <w:color w:val="222222"/>
+          <w:sz w:val="22"/>
+        </w:rPr>
+        <w:t>超链接：</w:t>
+      </w:r>
+      <w:r>
+        <w:rPr>
+          <w:rFonts w:ascii="Calibri" w:hAnsi="Calibri" w:eastAsia="WenQuanYi Micro Hei" w:cs="Calibri"/>
+          <w:b w:val="0"/>
+          <w:i w:val="0"/>
+          <w:color w:val="222222"/>
+          <w:sz w:val="22"/>
+        </w:rPr>
+        <w:t xml:space="preserve"> </w:t>
+      </w:r>
+      <w:hyperlink r:id="rId19">
+        <w:r>
+          <w:rPr>
+            <w:color w:val="1A5F9E"/>
+            <w:u w:val="single"/>
+            <w:sz w:val="22"/>
+            <w:rFonts w:ascii="Calibri" w:hAnsi="Calibri" w:eastAsia="WenQuanYi Micro Hei"/>
+          </w:rPr>
+          <w:t xml:space="preserve">DOI 10.1002/dneu.20457</w:t>
+        </w:r>
+      </w:hyperlink>
+      <w:r>
+        <w:rPr>
+          <w:rFonts w:ascii="Calibri" w:hAnsi="Calibri" w:eastAsia="WenQuanYi Micro Hei" w:cs="Calibri"/>
+          <w:b w:val="0"/>
+          <w:i w:val="0"/>
+          <w:color w:val="222222"/>
+          <w:sz w:val="22"/>
+        </w:rPr>
+        <w:t xml:space="preserve"> · </w:t>
+      </w:r>
+      <w:hyperlink r:id="rId20">
+        <w:r>
+          <w:rPr>
+            <w:color w:val="1A5F9E"/>
+            <w:u w:val="single"/>
+            <w:sz w:val="22"/>
+            <w:rFonts w:ascii="Calibri" w:hAnsi="Calibri" w:eastAsia="WenQuanYi Micro Hei"/>
+          </w:rPr>
+          <w:t xml:space="preserve">PubMed 17638384</w:t>
+        </w:r>
+      </w:hyperlink>
+      <w:r>
+        <w:rPr>
+          <w:rFonts w:ascii="Calibri" w:hAnsi="Calibri" w:eastAsia="WenQuanYi Micro Hei" w:cs="Calibri"/>
+          <w:b w:val="0"/>
+          <w:i w:val="0"/>
+          <w:color w:val="222222"/>
+          <w:sz w:val="22"/>
+        </w:rPr>
+        <w:t xml:space="preserve"> 单位：不列颠哥伦比亚大学。 类型：成体雄鼠神经发生。</w:t>
       </w:r>
     </w:p>
     <w:p>
@@ -527,7 +1705,7 @@
       <w:r>
         <w:rPr>
           <w:rFonts w:ascii="Calibri" w:hAnsi="Calibri" w:eastAsia="WenQuanYi Micro Hei" w:cs="Calibri"/>
-          <w:b w:val="0"/>
+          <w:b/>
           <w:i w:val="0"/>
           <w:color w:val="222222"/>
           <w:sz w:val="22"/>
@@ -548,7 +1726,27 @@
           <w:color w:val="222222"/>
           <w:sz w:val="22"/>
         </w:rPr>
-        <w:t>•  去势使齿状回 BrdU 标记细胞的 **30 天存活显著下降**，但增殖变化不显著。</w:t>
+        <w:t xml:space="preserve">•  去势使齿状回 BrdU 标记细胞的 </w:t>
+      </w:r>
+      <w:r>
+        <w:rPr>
+          <w:rFonts w:ascii="Calibri" w:hAnsi="Calibri" w:eastAsia="WenQuanYi Micro Hei" w:cs="Calibri"/>
+          <w:b/>
+          <w:i w:val="0"/>
+          <w:color w:val="222222"/>
+          <w:sz w:val="22"/>
+        </w:rPr>
+        <w:t>30 天存活显著下降</w:t>
+      </w:r>
+      <w:r>
+        <w:rPr>
+          <w:rFonts w:ascii="Calibri" w:hAnsi="Calibri" w:eastAsia="WenQuanYi Micro Hei" w:cs="Calibri"/>
+          <w:b w:val="0"/>
+          <w:i w:val="0"/>
+          <w:color w:val="222222"/>
+          <w:sz w:val="22"/>
+        </w:rPr>
+        <w:t>，但增殖变化不显著。</w:t>
       </w:r>
     </w:p>
     <w:p>
@@ -606,7 +1804,7 @@
       <w:r>
         <w:rPr>
           <w:rFonts w:ascii="Calibri" w:hAnsi="Calibri" w:eastAsia="WenQuanYi Micro Hei" w:cs="Calibri"/>
-          <w:b w:val="0"/>
+          <w:b/>
           <w:i w:val="0"/>
           <w:color w:val="222222"/>
           <w:sz w:val="22"/>
@@ -627,7 +1825,27 @@
           <w:color w:val="222222"/>
           <w:sz w:val="22"/>
         </w:rPr>
-        <w:t>•  **保护发生在“活下来”而不是“多分裂”**：对应慢性压力最爱打的那个环节（新生颗粒细胞存活差）。</w:t>
+        <w:t xml:space="preserve">•  </w:t>
+      </w:r>
+      <w:r>
+        <w:rPr>
+          <w:rFonts w:ascii="Calibri" w:hAnsi="Calibri" w:eastAsia="WenQuanYi Micro Hei" w:cs="Calibri"/>
+          <w:b/>
+          <w:i w:val="0"/>
+          <w:color w:val="222222"/>
+          <w:sz w:val="22"/>
+        </w:rPr>
+        <w:t>保护发生在“活下来”而不是“多分裂”</w:t>
+      </w:r>
+      <w:r>
+        <w:rPr>
+          <w:rFonts w:ascii="Calibri" w:hAnsi="Calibri" w:eastAsia="WenQuanYi Micro Hei" w:cs="Calibri"/>
+          <w:b w:val="0"/>
+          <w:i w:val="0"/>
+          <w:color w:val="222222"/>
+          <w:sz w:val="22"/>
+        </w:rPr>
+        <w:t>：对应慢性压力最爱打的那个环节（新生颗粒细胞存活差）。</w:t>
       </w:r>
     </w:p>
     <w:p>
@@ -643,7 +1861,27 @@
           <w:color w:val="222222"/>
           <w:sz w:val="22"/>
         </w:rPr>
-        <w:t>•  **剂量有门槛**：太低的睾酮等于没给。</w:t>
+        <w:t xml:space="preserve">•  </w:t>
+      </w:r>
+      <w:r>
+        <w:rPr>
+          <w:rFonts w:ascii="Calibri" w:hAnsi="Calibri" w:eastAsia="WenQuanYi Micro Hei" w:cs="Calibri"/>
+          <w:b/>
+          <w:i w:val="0"/>
+          <w:color w:val="222222"/>
+          <w:sz w:val="22"/>
+        </w:rPr>
+        <w:t>剂量有门槛</w:t>
+      </w:r>
+      <w:r>
+        <w:rPr>
+          <w:rFonts w:ascii="Calibri" w:hAnsi="Calibri" w:eastAsia="WenQuanYi Micro Hei" w:cs="Calibri"/>
+          <w:b w:val="0"/>
+          <w:i w:val="0"/>
+          <w:color w:val="222222"/>
+          <w:sz w:val="22"/>
+        </w:rPr>
+        <w:t>：太低的睾酮等于没给。</w:t>
       </w:r>
     </w:p>
     <w:p>
@@ -659,7 +1897,47 @@
           <w:color w:val="222222"/>
           <w:sz w:val="22"/>
         </w:rPr>
-        <w:t>•  **这条路偏雄激素性**：DHT 有效、E2 无效，和 Lund 2006 的 ERβ 刹车是**另一条**平行机制。</w:t>
+        <w:t xml:space="preserve">•  </w:t>
+      </w:r>
+      <w:r>
+        <w:rPr>
+          <w:rFonts w:ascii="Calibri" w:hAnsi="Calibri" w:eastAsia="WenQuanYi Micro Hei" w:cs="Calibri"/>
+          <w:b/>
+          <w:i w:val="0"/>
+          <w:color w:val="222222"/>
+          <w:sz w:val="22"/>
+        </w:rPr>
+        <w:t>这条路偏雄激素性</w:t>
+      </w:r>
+      <w:r>
+        <w:rPr>
+          <w:rFonts w:ascii="Calibri" w:hAnsi="Calibri" w:eastAsia="WenQuanYi Micro Hei" w:cs="Calibri"/>
+          <w:b w:val="0"/>
+          <w:i w:val="0"/>
+          <w:color w:val="222222"/>
+          <w:sz w:val="22"/>
+        </w:rPr>
+        <w:t>：DHT 有效、E2 无效，和 Lund 2006 的 ERβ 刹车是</w:t>
+      </w:r>
+      <w:r>
+        <w:rPr>
+          <w:rFonts w:ascii="Calibri" w:hAnsi="Calibri" w:eastAsia="WenQuanYi Micro Hei" w:cs="Calibri"/>
+          <w:b/>
+          <w:i w:val="0"/>
+          <w:color w:val="222222"/>
+          <w:sz w:val="22"/>
+        </w:rPr>
+        <w:t>另一条</w:t>
+      </w:r>
+      <w:r>
+        <w:rPr>
+          <w:rFonts w:ascii="Calibri" w:hAnsi="Calibri" w:eastAsia="WenQuanYi Micro Hei" w:cs="Calibri"/>
+          <w:b w:val="0"/>
+          <w:i w:val="0"/>
+          <w:color w:val="222222"/>
+          <w:sz w:val="22"/>
+        </w:rPr>
+        <w:t>平行机制。</w:t>
       </w:r>
     </w:p>
     <w:p>
@@ -675,7 +1953,27 @@
           <w:color w:val="222222"/>
           <w:sz w:val="22"/>
         </w:rPr>
-        <w:t>•  **海马结构的“库存”被保住了**：长期看就是对抗海马萎缩的正方向。</w:t>
+        <w:t xml:space="preserve">•  </w:t>
+      </w:r>
+      <w:r>
+        <w:rPr>
+          <w:rFonts w:ascii="Calibri" w:hAnsi="Calibri" w:eastAsia="WenQuanYi Micro Hei" w:cs="Calibri"/>
+          <w:b/>
+          <w:i w:val="0"/>
+          <w:color w:val="222222"/>
+          <w:sz w:val="22"/>
+        </w:rPr>
+        <w:t>海马结构的“库存”被保住了</w:t>
+      </w:r>
+      <w:r>
+        <w:rPr>
+          <w:rFonts w:ascii="Calibri" w:hAnsi="Calibri" w:eastAsia="WenQuanYi Micro Hei" w:cs="Calibri"/>
+          <w:b w:val="0"/>
+          <w:i w:val="0"/>
+          <w:color w:val="222222"/>
+          <w:sz w:val="22"/>
+        </w:rPr>
+        <w:t>：长期看就是对抗海马萎缩的正方向。</w:t>
       </w:r>
     </w:p>
     <w:p>
@@ -685,12 +1983,22 @@
       <w:r>
         <w:rPr>
           <w:rFonts w:ascii="Calibri" w:hAnsi="Calibri" w:eastAsia="WenQuanYi Micro Hei" w:cs="Calibri"/>
+          <w:b/>
+          <w:i w:val="0"/>
+          <w:color w:val="222222"/>
+          <w:sz w:val="22"/>
+        </w:rPr>
+        <w:t>主要结论（论点）</w:t>
+      </w:r>
+      <w:r>
+        <w:rPr>
+          <w:rFonts w:ascii="Calibri" w:hAnsi="Calibri" w:eastAsia="WenQuanYi Micro Hei" w:cs="Calibri"/>
           <w:b w:val="0"/>
           <w:i w:val="0"/>
           <w:color w:val="222222"/>
           <w:sz w:val="22"/>
         </w:rPr>
-        <w:t>主要结论（论点） 睾酮通过雄激素依赖机制提高成年海马新生神经元存活，从而在结构层面对抗压力和衰老带来的齿状回损耗。</w:t>
+        <w:t xml:space="preserve"> 睾酮通过雄激素依赖机制提高成年海马新生神经元存活，从而在结构层面对抗压力和衰老带来的齿状回损耗。</w:t>
       </w:r>
     </w:p>
     <w:p>
@@ -715,12 +2023,83 @@
       <w:r>
         <w:rPr>
           <w:rFonts w:ascii="Calibri" w:hAnsi="Calibri" w:eastAsia="WenQuanYi Micro Hei" w:cs="Calibri"/>
+          <w:b/>
+          <w:i w:val="0"/>
+          <w:color w:val="222222"/>
+          <w:sz w:val="22"/>
+        </w:rPr>
+        <w:t>出处</w:t>
+      </w:r>
+      <w:r>
+        <w:rPr>
+          <w:rFonts w:ascii="Calibri" w:hAnsi="Calibri" w:eastAsia="WenQuanYi Micro Hei" w:cs="Calibri"/>
           <w:b w:val="0"/>
           <w:i w:val="0"/>
           <w:color w:val="222222"/>
           <w:sz w:val="22"/>
         </w:rPr>
-        <w:t>出处 Hamson DK, Wainwright SR, Taylor JR, Jones BA, Watson NV, Galea LAM. Androgens increase survival of adult-born neurons in the dentate gyrus by an androgen receptor-dependent mechanism in male rats. *Endocrinology*. 2013;154(11):4461–4472. DOI：10.1210/en.2013-1129 单位：不列颠哥伦比亚大学等。 类型：Tfm（AR 突变）鼠 + 氟他胺阻断。</w:t>
+        <w:t xml:space="preserve"> Hamson DK, Wainwright SR, Taylor JR, Jones BA, Watson NV, Galea LAM. Androgens increase survival of adult-born neurons in the dentate gyrus by an androgen receptor-dependent mechanism in male rats. *Endocrinology*. 2013;154(11):4461–4472. </w:t>
+      </w:r>
+      <w:r>
+        <w:rPr>
+          <w:rFonts w:ascii="Calibri" w:hAnsi="Calibri" w:eastAsia="WenQuanYi Micro Hei" w:cs="Calibri"/>
+          <w:b/>
+          <w:i w:val="0"/>
+          <w:color w:val="222222"/>
+          <w:sz w:val="22"/>
+        </w:rPr>
+        <w:t>来源标注：</w:t>
+      </w:r>
+      <w:r>
+        <w:rPr>
+          <w:rFonts w:ascii="Calibri" w:hAnsi="Calibri" w:eastAsia="WenQuanYi Micro Hei" w:cs="Calibri"/>
+          <w:b w:val="0"/>
+          <w:i w:val="0"/>
+          <w:color w:val="222222"/>
+          <w:sz w:val="22"/>
+        </w:rPr>
+        <w:t xml:space="preserve">【Cursor网搜】用户截图 / 提问未点名本篇。 </w:t>
+      </w:r>
+      <w:r>
+        <w:rPr>
+          <w:rFonts w:ascii="Calibri" w:hAnsi="Calibri" w:eastAsia="WenQuanYi Micro Hei" w:cs="Calibri"/>
+          <w:b/>
+          <w:i w:val="0"/>
+          <w:color w:val="222222"/>
+          <w:sz w:val="22"/>
+        </w:rPr>
+        <w:t>超链接：</w:t>
+      </w:r>
+      <w:r>
+        <w:rPr>
+          <w:rFonts w:ascii="Calibri" w:hAnsi="Calibri" w:eastAsia="WenQuanYi Micro Hei" w:cs="Calibri"/>
+          <w:b w:val="0"/>
+          <w:i w:val="0"/>
+          <w:color w:val="222222"/>
+          <w:sz w:val="22"/>
+        </w:rPr>
+        <w:t xml:space="preserve"> </w:t>
+      </w:r>
+      <w:hyperlink r:id="rId21">
+        <w:r>
+          <w:rPr>
+            <w:color w:val="1A5F9E"/>
+            <w:u w:val="single"/>
+            <w:sz w:val="22"/>
+            <w:rFonts w:ascii="Calibri" w:hAnsi="Calibri" w:eastAsia="WenQuanYi Micro Hei"/>
+          </w:rPr>
+          <w:t xml:space="preserve">DOI 10.1210/en.2013-1129</w:t>
+        </w:r>
+      </w:hyperlink>
+      <w:r>
+        <w:rPr>
+          <w:rFonts w:ascii="Calibri" w:hAnsi="Calibri" w:eastAsia="WenQuanYi Micro Hei" w:cs="Calibri"/>
+          <w:b w:val="0"/>
+          <w:i w:val="0"/>
+          <w:color w:val="222222"/>
+          <w:sz w:val="22"/>
+        </w:rPr>
+        <w:t xml:space="preserve"> 单位：不列颠哥伦比亚大学等。 类型：Tfm（AR 突变）鼠 + 氟他胺阻断。</w:t>
       </w:r>
     </w:p>
     <w:p>
@@ -730,7 +2109,7 @@
       <w:r>
         <w:rPr>
           <w:rFonts w:ascii="Calibri" w:hAnsi="Calibri" w:eastAsia="WenQuanYi Micro Hei" w:cs="Calibri"/>
-          <w:b w:val="0"/>
+          <w:b/>
           <w:i w:val="0"/>
           <w:color w:val="222222"/>
           <w:sz w:val="22"/>
@@ -809,7 +2188,7 @@
       <w:r>
         <w:rPr>
           <w:rFonts w:ascii="Calibri" w:hAnsi="Calibri" w:eastAsia="WenQuanYi Micro Hei" w:cs="Calibri"/>
-          <w:b w:val="0"/>
+          <w:b/>
           <w:i w:val="0"/>
           <w:color w:val="222222"/>
           <w:sz w:val="22"/>
@@ -830,7 +2209,27 @@
           <w:color w:val="222222"/>
           <w:sz w:val="22"/>
         </w:rPr>
-        <w:t>•  **把 Spritzer 2007 钉死到 AR 上**：不是非特异营养，是受体依赖。</w:t>
+        <w:t xml:space="preserve">•  </w:t>
+      </w:r>
+      <w:r>
+        <w:rPr>
+          <w:rFonts w:ascii="Calibri" w:hAnsi="Calibri" w:eastAsia="WenQuanYi Micro Hei" w:cs="Calibri"/>
+          <w:b/>
+          <w:i w:val="0"/>
+          <w:color w:val="222222"/>
+          <w:sz w:val="22"/>
+        </w:rPr>
+        <w:t>把 Spritzer 2007 钉死到 AR 上</w:t>
+      </w:r>
+      <w:r>
+        <w:rPr>
+          <w:rFonts w:ascii="Calibri" w:hAnsi="Calibri" w:eastAsia="WenQuanYi Micro Hei" w:cs="Calibri"/>
+          <w:b w:val="0"/>
+          <w:i w:val="0"/>
+          <w:color w:val="222222"/>
+          <w:sz w:val="22"/>
+        </w:rPr>
+        <w:t>：不是非特异营养，是受体依赖。</w:t>
       </w:r>
     </w:p>
     <w:p>
@@ -846,7 +2245,27 @@
           <w:color w:val="222222"/>
           <w:sz w:val="22"/>
         </w:rPr>
-        <w:t>•  **作用点可以是回路级的**，不必要求新生细胞自己表达 AR。</w:t>
+        <w:t xml:space="preserve">•  </w:t>
+      </w:r>
+      <w:r>
+        <w:rPr>
+          <w:rFonts w:ascii="Calibri" w:hAnsi="Calibri" w:eastAsia="WenQuanYi Micro Hei" w:cs="Calibri"/>
+          <w:b/>
+          <w:i w:val="0"/>
+          <w:color w:val="222222"/>
+          <w:sz w:val="22"/>
+        </w:rPr>
+        <w:t>作用点可以是回路级的</w:t>
+      </w:r>
+      <w:r>
+        <w:rPr>
+          <w:rFonts w:ascii="Calibri" w:hAnsi="Calibri" w:eastAsia="WenQuanYi Micro Hei" w:cs="Calibri"/>
+          <w:b w:val="0"/>
+          <w:i w:val="0"/>
+          <w:color w:val="222222"/>
+          <w:sz w:val="22"/>
+        </w:rPr>
+        <w:t>，不必要求新生细胞自己表达 AR。</w:t>
       </w:r>
     </w:p>
     <w:p>
@@ -862,7 +2281,27 @@
           <w:color w:val="222222"/>
           <w:sz w:val="22"/>
         </w:rPr>
-        <w:t>•  **与 Lund 的 ERβ 路径并存**：HPA 刹车可以走 ERβ，海马内存活可以走 AR。</w:t>
+        <w:t xml:space="preserve">•  </w:t>
+      </w:r>
+      <w:r>
+        <w:rPr>
+          <w:rFonts w:ascii="Calibri" w:hAnsi="Calibri" w:eastAsia="WenQuanYi Micro Hei" w:cs="Calibri"/>
+          <w:b/>
+          <w:i w:val="0"/>
+          <w:color w:val="222222"/>
+          <w:sz w:val="22"/>
+        </w:rPr>
+        <w:t>与 Lund 的 ERβ 路径并存</w:t>
+      </w:r>
+      <w:r>
+        <w:rPr>
+          <w:rFonts w:ascii="Calibri" w:hAnsi="Calibri" w:eastAsia="WenQuanYi Micro Hei" w:cs="Calibri"/>
+          <w:b w:val="0"/>
+          <w:i w:val="0"/>
+          <w:color w:val="222222"/>
+          <w:sz w:val="22"/>
+        </w:rPr>
+        <w:t>：HPA 刹车可以走 ERβ，海马内存活可以走 AR。</w:t>
       </w:r>
     </w:p>
     <w:p>
@@ -878,7 +2317,27 @@
           <w:color w:val="222222"/>
           <w:sz w:val="22"/>
         </w:rPr>
-        <w:t>•  **临床推论**：单纯补睾酮若 AR 功能差，海马保护可能落空。</w:t>
+        <w:t xml:space="preserve">•  </w:t>
+      </w:r>
+      <w:r>
+        <w:rPr>
+          <w:rFonts w:ascii="Calibri" w:hAnsi="Calibri" w:eastAsia="WenQuanYi Micro Hei" w:cs="Calibri"/>
+          <w:b/>
+          <w:i w:val="0"/>
+          <w:color w:val="222222"/>
+          <w:sz w:val="22"/>
+        </w:rPr>
+        <w:t>临床推论</w:t>
+      </w:r>
+      <w:r>
+        <w:rPr>
+          <w:rFonts w:ascii="Calibri" w:hAnsi="Calibri" w:eastAsia="WenQuanYi Micro Hei" w:cs="Calibri"/>
+          <w:b w:val="0"/>
+          <w:i w:val="0"/>
+          <w:color w:val="222222"/>
+          <w:sz w:val="22"/>
+        </w:rPr>
+        <w:t>：单纯补睾酮若 AR 功能差，海马保护可能落空。</w:t>
       </w:r>
     </w:p>
     <w:p>
@@ -888,12 +2347,22 @@
       <w:r>
         <w:rPr>
           <w:rFonts w:ascii="Calibri" w:hAnsi="Calibri" w:eastAsia="WenQuanYi Micro Hei" w:cs="Calibri"/>
+          <w:b/>
+          <w:i w:val="0"/>
+          <w:color w:val="222222"/>
+          <w:sz w:val="22"/>
+        </w:rPr>
+        <w:t>主要结论（论点）</w:t>
+      </w:r>
+      <w:r>
+        <w:rPr>
+          <w:rFonts w:ascii="Calibri" w:hAnsi="Calibri" w:eastAsia="WenQuanYi Micro Hei" w:cs="Calibri"/>
           <w:b w:val="0"/>
           <w:i w:val="0"/>
           <w:color w:val="222222"/>
           <w:sz w:val="22"/>
         </w:rPr>
-        <w:t>主要结论（论点） 雄激素提高齿状回新生神经元存活依赖 AR；保护可以是间接回路效应，而不是新生细胞上的直接贴牌。</w:t>
+        <w:t xml:space="preserve"> 雄激素提高齿状回新生神经元存活依赖 AR；保护可以是间接回路效应，而不是新生细胞上的直接贴牌。</w:t>
       </w:r>
     </w:p>
     <w:p>
@@ -918,12 +2387,125 @@
       <w:r>
         <w:rPr>
           <w:rFonts w:ascii="Calibri" w:hAnsi="Calibri" w:eastAsia="WenQuanYi Micro Hei" w:cs="Calibri"/>
+          <w:b/>
+          <w:i w:val="0"/>
+          <w:color w:val="222222"/>
+          <w:sz w:val="22"/>
+        </w:rPr>
+        <w:t>出处</w:t>
+      </w:r>
+      <w:r>
+        <w:rPr>
+          <w:rFonts w:ascii="Calibri" w:hAnsi="Calibri" w:eastAsia="WenQuanYi Micro Hei" w:cs="Calibri"/>
           <w:b w:val="0"/>
           <w:i w:val="0"/>
           <w:color w:val="222222"/>
           <w:sz w:val="22"/>
         </w:rPr>
-        <w:t>出处 Panizzon MS, Hauger RL, Xian H, 等. Interactive effects of testosterone and cortisol on hippocampal volume and episodic memory in middle-aged men. *Psychoneuroendocrinology*. 2018;91:65–73. DOI：10.1016/j.psyneuen.2018.03.003 PMID：29547742 样本：越南时期双胞胎衰老研究（VETSA），平均年龄 56.3 岁（51–60）。 类型：健康中年男性唾液激素 AUC × MRI 海马体积 × 情景记忆。</w:t>
+        <w:t xml:space="preserve"> Panizzon MS, Hauger RL, Xian H, 等. Interactive effects of testosterone and cortisol on hippocampal volume and episodic memory in middle-aged men. *Psychoneuroendocrinology*. 2018;91:65–73. </w:t>
+      </w:r>
+      <w:r>
+        <w:rPr>
+          <w:rFonts w:ascii="Calibri" w:hAnsi="Calibri" w:eastAsia="WenQuanYi Micro Hei" w:cs="Calibri"/>
+          <w:b/>
+          <w:i w:val="0"/>
+          <w:color w:val="222222"/>
+          <w:sz w:val="22"/>
+        </w:rPr>
+        <w:t>来源标注：</w:t>
+      </w:r>
+      <w:r>
+        <w:rPr>
+          <w:rFonts w:ascii="Calibri" w:hAnsi="Calibri" w:eastAsia="WenQuanYi Micro Hei" w:cs="Calibri"/>
+          <w:b w:val="0"/>
+          <w:i w:val="0"/>
+          <w:color w:val="222222"/>
+          <w:sz w:val="22"/>
+        </w:rPr>
+        <w:t xml:space="preserve">【Cursor网搜】用户截图 / 提问未点名本篇。 </w:t>
+      </w:r>
+      <w:r>
+        <w:rPr>
+          <w:rFonts w:ascii="Calibri" w:hAnsi="Calibri" w:eastAsia="WenQuanYi Micro Hei" w:cs="Calibri"/>
+          <w:b/>
+          <w:i w:val="0"/>
+          <w:color w:val="222222"/>
+          <w:sz w:val="22"/>
+        </w:rPr>
+        <w:t>超链接：</w:t>
+      </w:r>
+      <w:r>
+        <w:rPr>
+          <w:rFonts w:ascii="Calibri" w:hAnsi="Calibri" w:eastAsia="WenQuanYi Micro Hei" w:cs="Calibri"/>
+          <w:b w:val="0"/>
+          <w:i w:val="0"/>
+          <w:color w:val="222222"/>
+          <w:sz w:val="22"/>
+        </w:rPr>
+        <w:t xml:space="preserve"> </w:t>
+      </w:r>
+      <w:hyperlink r:id="rId22">
+        <w:r>
+          <w:rPr>
+            <w:color w:val="1A5F9E"/>
+            <w:u w:val="single"/>
+            <w:sz w:val="22"/>
+            <w:rFonts w:ascii="Calibri" w:hAnsi="Calibri" w:eastAsia="WenQuanYi Micro Hei"/>
+          </w:rPr>
+          <w:t xml:space="preserve">DOI 10.1016/j.psyneuen.2018.03.003</w:t>
+        </w:r>
+      </w:hyperlink>
+      <w:r>
+        <w:rPr>
+          <w:rFonts w:ascii="Calibri" w:hAnsi="Calibri" w:eastAsia="WenQuanYi Micro Hei" w:cs="Calibri"/>
+          <w:b w:val="0"/>
+          <w:i w:val="0"/>
+          <w:color w:val="222222"/>
+          <w:sz w:val="22"/>
+        </w:rPr>
+        <w:t xml:space="preserve"> · </w:t>
+      </w:r>
+      <w:hyperlink r:id="rId23">
+        <w:r>
+          <w:rPr>
+            <w:color w:val="1A5F9E"/>
+            <w:u w:val="single"/>
+            <w:sz w:val="22"/>
+            <w:rFonts w:ascii="Calibri" w:hAnsi="Calibri" w:eastAsia="WenQuanYi Micro Hei"/>
+          </w:rPr>
+          <w:t xml:space="preserve">PMC 5931212</w:t>
+        </w:r>
+      </w:hyperlink>
+      <w:r>
+        <w:rPr>
+          <w:rFonts w:ascii="Calibri" w:hAnsi="Calibri" w:eastAsia="WenQuanYi Micro Hei" w:cs="Calibri"/>
+          <w:b w:val="0"/>
+          <w:i w:val="0"/>
+          <w:color w:val="222222"/>
+          <w:sz w:val="22"/>
+        </w:rPr>
+        <w:t xml:space="preserve"> · </w:t>
+      </w:r>
+      <w:hyperlink r:id="rId24">
+        <w:r>
+          <w:rPr>
+            <w:color w:val="1A5F9E"/>
+            <w:u w:val="single"/>
+            <w:sz w:val="22"/>
+            <w:rFonts w:ascii="Calibri" w:hAnsi="Calibri" w:eastAsia="WenQuanYi Micro Hei"/>
+          </w:rPr>
+          <w:t xml:space="preserve">PubMed 29547742</w:t>
+        </w:r>
+      </w:hyperlink>
+      <w:r>
+        <w:rPr>
+          <w:rFonts w:ascii="Calibri" w:hAnsi="Calibri" w:eastAsia="WenQuanYi Micro Hei" w:cs="Calibri"/>
+          <w:b w:val="0"/>
+          <w:i w:val="0"/>
+          <w:color w:val="222222"/>
+          <w:sz w:val="22"/>
+        </w:rPr>
+        <w:t xml:space="preserve"> 样本：越南时期双胞胎衰老研究（VETSA），平均年龄 56.3 岁（51–60）。 类型：健康中年男性唾液激素 AUC × MRI 海马体积 × 情景记忆。</w:t>
       </w:r>
     </w:p>
     <w:p>
@@ -933,7 +2515,7 @@
       <w:r>
         <w:rPr>
           <w:rFonts w:ascii="Calibri" w:hAnsi="Calibri" w:eastAsia="WenQuanYi Micro Hei" w:cs="Calibri"/>
-          <w:b w:val="0"/>
+          <w:b/>
           <w:i w:val="0"/>
           <w:color w:val="222222"/>
           <w:sz w:val="22"/>
@@ -954,7 +2536,27 @@
           <w:color w:val="222222"/>
           <w:sz w:val="22"/>
         </w:rPr>
-        <w:t>•  睾酮或皮质醇**单独**都不能稳定预测海马体积或情景记忆。</w:t>
+        <w:t>•  睾酮或皮质醇</w:t>
+      </w:r>
+      <w:r>
+        <w:rPr>
+          <w:rFonts w:ascii="Calibri" w:hAnsi="Calibri" w:eastAsia="WenQuanYi Micro Hei" w:cs="Calibri"/>
+          <w:b/>
+          <w:i w:val="0"/>
+          <w:color w:val="222222"/>
+          <w:sz w:val="22"/>
+        </w:rPr>
+        <w:t>单独</w:t>
+      </w:r>
+      <w:r>
+        <w:rPr>
+          <w:rFonts w:ascii="Calibri" w:hAnsi="Calibri" w:eastAsia="WenQuanYi Micro Hei" w:cs="Calibri"/>
+          <w:b w:val="0"/>
+          <w:i w:val="0"/>
+          <w:color w:val="222222"/>
+          <w:sz w:val="22"/>
+        </w:rPr>
+        <w:t>都不能稳定预测海马体积或情景记忆。</w:t>
       </w:r>
     </w:p>
     <w:p>
@@ -1028,7 +2630,7 @@
       <w:r>
         <w:rPr>
           <w:rFonts w:ascii="Calibri" w:hAnsi="Calibri" w:eastAsia="WenQuanYi Micro Hei" w:cs="Calibri"/>
-          <w:b w:val="0"/>
+          <w:b/>
           <w:i w:val="0"/>
           <w:color w:val="222222"/>
           <w:sz w:val="22"/>
@@ -1049,7 +2651,27 @@
           <w:color w:val="222222"/>
           <w:sz w:val="22"/>
         </w:rPr>
-        <w:t>•  **人身上把“有条件保护”测出来了**，不是只有大鼠。</w:t>
+        <w:t xml:space="preserve">•  </w:t>
+      </w:r>
+      <w:r>
+        <w:rPr>
+          <w:rFonts w:ascii="Calibri" w:hAnsi="Calibri" w:eastAsia="WenQuanYi Micro Hei" w:cs="Calibri"/>
+          <w:b/>
+          <w:i w:val="0"/>
+          <w:color w:val="222222"/>
+          <w:sz w:val="22"/>
+        </w:rPr>
+        <w:t>人身上把“有条件保护”测出来了</w:t>
+      </w:r>
+      <w:r>
+        <w:rPr>
+          <w:rFonts w:ascii="Calibri" w:hAnsi="Calibri" w:eastAsia="WenQuanYi Micro Hei" w:cs="Calibri"/>
+          <w:b w:val="0"/>
+          <w:i w:val="0"/>
+          <w:color w:val="222222"/>
+          <w:sz w:val="22"/>
+        </w:rPr>
+        <w:t>，不是只有大鼠。</w:t>
       </w:r>
     </w:p>
     <w:p>
@@ -1065,7 +2687,27 @@
           <w:color w:val="222222"/>
           <w:sz w:val="22"/>
         </w:rPr>
-        <w:t>•  **单独看睾酮会得出混乱结论**，必须和皮质醇一起看。</w:t>
+        <w:t xml:space="preserve">•  </w:t>
+      </w:r>
+      <w:r>
+        <w:rPr>
+          <w:rFonts w:ascii="Calibri" w:hAnsi="Calibri" w:eastAsia="WenQuanYi Micro Hei" w:cs="Calibri"/>
+          <w:b/>
+          <w:i w:val="0"/>
+          <w:color w:val="222222"/>
+          <w:sz w:val="22"/>
+        </w:rPr>
+        <w:t>单独看睾酮会得出混乱结论</w:t>
+      </w:r>
+      <w:r>
+        <w:rPr>
+          <w:rFonts w:ascii="Calibri" w:hAnsi="Calibri" w:eastAsia="WenQuanYi Micro Hei" w:cs="Calibri"/>
+          <w:b w:val="0"/>
+          <w:i w:val="0"/>
+          <w:color w:val="222222"/>
+          <w:sz w:val="22"/>
+        </w:rPr>
+        <w:t>，必须和皮质醇一起看。</w:t>
       </w:r>
     </w:p>
     <w:p>
@@ -1081,7 +2723,27 @@
           <w:color w:val="222222"/>
           <w:sz w:val="22"/>
         </w:rPr>
-        <w:t>•  **与职业耗竭语境直接相关**：耗竭是高压力 / 高皮质醇负荷的窗口，此时雄激素底子更可能是保护因素。</w:t>
+        <w:t xml:space="preserve">•  </w:t>
+      </w:r>
+      <w:r>
+        <w:rPr>
+          <w:rFonts w:ascii="Calibri" w:hAnsi="Calibri" w:eastAsia="WenQuanYi Micro Hei" w:cs="Calibri"/>
+          <w:b/>
+          <w:i w:val="0"/>
+          <w:color w:val="222222"/>
+          <w:sz w:val="22"/>
+        </w:rPr>
+        <w:t>与职业耗竭语境直接相关</w:t>
+      </w:r>
+      <w:r>
+        <w:rPr>
+          <w:rFonts w:ascii="Calibri" w:hAnsi="Calibri" w:eastAsia="WenQuanYi Micro Hei" w:cs="Calibri"/>
+          <w:b w:val="0"/>
+          <w:i w:val="0"/>
+          <w:color w:val="222222"/>
+          <w:sz w:val="22"/>
+        </w:rPr>
+        <w:t>：耗竭是高压力 / 高皮质醇负荷的窗口，此时雄激素底子更可能是保护因素。</w:t>
       </w:r>
     </w:p>
     <w:p>
@@ -1097,7 +2759,27 @@
           <w:color w:val="222222"/>
           <w:sz w:val="22"/>
         </w:rPr>
-        <w:t>•  **反对“越高越好”**：低应激生理状态下把睾酮抬很高，未必对海马友好。</w:t>
+        <w:t xml:space="preserve">•  </w:t>
+      </w:r>
+      <w:r>
+        <w:rPr>
+          <w:rFonts w:ascii="Calibri" w:hAnsi="Calibri" w:eastAsia="WenQuanYi Micro Hei" w:cs="Calibri"/>
+          <w:b/>
+          <w:i w:val="0"/>
+          <w:color w:val="222222"/>
+          <w:sz w:val="22"/>
+        </w:rPr>
+        <w:t>反对“越高越好”</w:t>
+      </w:r>
+      <w:r>
+        <w:rPr>
+          <w:rFonts w:ascii="Calibri" w:hAnsi="Calibri" w:eastAsia="WenQuanYi Micro Hei" w:cs="Calibri"/>
+          <w:b w:val="0"/>
+          <w:i w:val="0"/>
+          <w:color w:val="222222"/>
+          <w:sz w:val="22"/>
+        </w:rPr>
+        <w:t>：低应激生理状态下把睾酮抬很高，未必对海马友好。</w:t>
       </w:r>
     </w:p>
     <w:p>
@@ -1107,12 +2789,42 @@
       <w:r>
         <w:rPr>
           <w:rFonts w:ascii="Calibri" w:hAnsi="Calibri" w:eastAsia="WenQuanYi Micro Hei" w:cs="Calibri"/>
+          <w:b/>
+          <w:i w:val="0"/>
+          <w:color w:val="222222"/>
+          <w:sz w:val="22"/>
+        </w:rPr>
+        <w:t>主要结论（论点）</w:t>
+      </w:r>
+      <w:r>
+        <w:rPr>
+          <w:rFonts w:ascii="Calibri" w:hAnsi="Calibri" w:eastAsia="WenQuanYi Micro Hei" w:cs="Calibri"/>
           <w:b w:val="0"/>
           <w:i w:val="0"/>
           <w:color w:val="222222"/>
           <w:sz w:val="22"/>
         </w:rPr>
-        <w:t>主要结论（论点） 睾酮对人类海马和情景记忆的保护是与皮质醇的交互效应：在高皮质醇环境里它更像保护因素，脱离这个环境后符号可以反转。</w:t>
+        <w:t xml:space="preserve"> 睾酮对人类海马和情景记忆的保护是</w:t>
+      </w:r>
+      <w:r>
+        <w:rPr>
+          <w:rFonts w:ascii="Calibri" w:hAnsi="Calibri" w:eastAsia="WenQuanYi Micro Hei" w:cs="Calibri"/>
+          <w:b/>
+          <w:i w:val="0"/>
+          <w:color w:val="222222"/>
+          <w:sz w:val="22"/>
+        </w:rPr>
+        <w:t>与皮质醇的交互效应</w:t>
+      </w:r>
+      <w:r>
+        <w:rPr>
+          <w:rFonts w:ascii="Calibri" w:hAnsi="Calibri" w:eastAsia="WenQuanYi Micro Hei" w:cs="Calibri"/>
+          <w:b w:val="0"/>
+          <w:i w:val="0"/>
+          <w:color w:val="222222"/>
+          <w:sz w:val="22"/>
+        </w:rPr>
+        <w:t>：在高皮质醇环境里它更像保护因素，脱离这个环境后符号可以反转。</w:t>
       </w:r>
     </w:p>
     <w:p>
@@ -1127,7 +2839,7 @@
           <w:color w:val="1F3A5F"/>
           <w:sz w:val="32"/>
         </w:rPr>
-        <w:t>大陆境内论文 1</w:t>
+        <w:t>大陆境内论文 1（【Cursor网搜，非截图他源】）</w:t>
       </w:r>
     </w:p>
     <w:p>
@@ -1137,12 +2849,166 @@
       <w:r>
         <w:rPr>
           <w:rFonts w:ascii="Calibri" w:hAnsi="Calibri" w:eastAsia="WenQuanYi Micro Hei" w:cs="Calibri"/>
+          <w:b/>
+          <w:i w:val="0"/>
+          <w:color w:val="222222"/>
+          <w:sz w:val="22"/>
+        </w:rPr>
+        <w:t>出处</w:t>
+      </w:r>
+      <w:r>
+        <w:rPr>
+          <w:rFonts w:ascii="Calibri" w:hAnsi="Calibri" w:eastAsia="WenQuanYi Micro Hei" w:cs="Calibri"/>
           <w:b w:val="0"/>
           <w:i w:val="0"/>
           <w:color w:val="222222"/>
           <w:sz w:val="22"/>
         </w:rPr>
-        <w:t>出处 闫旭升, 杨占军, 贾建新, 宋伟, 方鑫, 蔡志平, 霍东升, Wang H. 睾酮对阿尔茨海默病模型大鼠认知功能障碍的保护机制. *神经再生研究* (Neural Regeneration Research). 2019;14(4):649–657. DOI：10.4103/1673-5374.245477 PMID：30632505 单位：内蒙古医科大学等。 期刊：在中国主办、国内外发行的神经再生类期刊（沈阳《神经再生研究》杂志社）。</w:t>
+        <w:t xml:space="preserve"> 闫旭升, 杨占军, 贾建新, 宋伟, 方鑫, 蔡志平, 霍东升, Wang H. 睾酮对阿尔茨海默病模型大鼠认知功能障碍的保护机制. *神经再生研究* (Neural Regeneration Research). 2019;14(4):649–657. </w:t>
+      </w:r>
+      <w:r>
+        <w:rPr>
+          <w:rFonts w:ascii="Calibri" w:hAnsi="Calibri" w:eastAsia="WenQuanYi Micro Hei" w:cs="Calibri"/>
+          <w:b/>
+          <w:i w:val="0"/>
+          <w:color w:val="222222"/>
+          <w:sz w:val="22"/>
+        </w:rPr>
+        <w:t>来源标注：</w:t>
+      </w:r>
+      <w:r>
+        <w:rPr>
+          <w:rFonts w:ascii="Calibri" w:hAnsi="Calibri" w:eastAsia="WenQuanYi Micro Hei" w:cs="Calibri"/>
+          <w:b w:val="0"/>
+          <w:i w:val="0"/>
+          <w:color w:val="222222"/>
+          <w:sz w:val="22"/>
+        </w:rPr>
+        <w:t>【Cursor网搜，非截图他源】用户提问要求“境内 2 篇”，但截图和提问</w:t>
+      </w:r>
+      <w:r>
+        <w:rPr>
+          <w:rFonts w:ascii="Calibri" w:hAnsi="Calibri" w:eastAsia="WenQuanYi Micro Hei" w:cs="Calibri"/>
+          <w:b/>
+          <w:i w:val="0"/>
+          <w:color w:val="222222"/>
+          <w:sz w:val="22"/>
+        </w:rPr>
+        <w:t>都没有写出闫旭升或《神经再生研究》</w:t>
+      </w:r>
+      <w:r>
+        <w:rPr>
+          <w:rFonts w:ascii="Calibri" w:hAnsi="Calibri" w:eastAsia="WenQuanYi Micro Hei" w:cs="Calibri"/>
+          <w:b w:val="0"/>
+          <w:i w:val="0"/>
+          <w:color w:val="222222"/>
+          <w:sz w:val="22"/>
+        </w:rPr>
+        <w:t xml:space="preserve">。本篇由 Cursor 网搜补入，用来覆盖“睾酮—海马突触—抗氧化”机制。 </w:t>
+      </w:r>
+      <w:r>
+        <w:rPr>
+          <w:rFonts w:ascii="Calibri" w:hAnsi="Calibri" w:eastAsia="WenQuanYi Micro Hei" w:cs="Calibri"/>
+          <w:b/>
+          <w:i w:val="0"/>
+          <w:color w:val="222222"/>
+          <w:sz w:val="22"/>
+        </w:rPr>
+        <w:t>超链接：</w:t>
+      </w:r>
+      <w:r>
+        <w:rPr>
+          <w:rFonts w:ascii="Calibri" w:hAnsi="Calibri" w:eastAsia="WenQuanYi Micro Hei" w:cs="Calibri"/>
+          <w:b w:val="0"/>
+          <w:i w:val="0"/>
+          <w:color w:val="222222"/>
+          <w:sz w:val="22"/>
+        </w:rPr>
+        <w:t xml:space="preserve"> </w:t>
+      </w:r>
+      <w:hyperlink r:id="rId12">
+        <w:r>
+          <w:rPr>
+            <w:color w:val="1A5F9E"/>
+            <w:u w:val="single"/>
+            <w:sz w:val="22"/>
+            <w:rFonts w:ascii="Calibri" w:hAnsi="Calibri" w:eastAsia="WenQuanYi Micro Hei"/>
+          </w:rPr>
+          <w:t xml:space="preserve">DOI 10.4103/1673-5374.245477</w:t>
+        </w:r>
+      </w:hyperlink>
+      <w:r>
+        <w:rPr>
+          <w:rFonts w:ascii="Calibri" w:hAnsi="Calibri" w:eastAsia="WenQuanYi Micro Hei" w:cs="Calibri"/>
+          <w:b w:val="0"/>
+          <w:i w:val="0"/>
+          <w:color w:val="222222"/>
+          <w:sz w:val="22"/>
+        </w:rPr>
+        <w:t xml:space="preserve"> · </w:t>
+      </w:r>
+      <w:hyperlink r:id="rId13">
+        <w:r>
+          <w:rPr>
+            <w:color w:val="1A5F9E"/>
+            <w:u w:val="single"/>
+            <w:sz w:val="22"/>
+            <w:rFonts w:ascii="Calibri" w:hAnsi="Calibri" w:eastAsia="WenQuanYi Micro Hei"/>
+          </w:rPr>
+          <w:t xml:space="preserve">PMC 免费全文</w:t>
+        </w:r>
+      </w:hyperlink>
+      <w:r>
+        <w:rPr>
+          <w:rFonts w:ascii="Calibri" w:hAnsi="Calibri" w:eastAsia="WenQuanYi Micro Hei" w:cs="Calibri"/>
+          <w:b w:val="0"/>
+          <w:i w:val="0"/>
+          <w:color w:val="222222"/>
+          <w:sz w:val="22"/>
+        </w:rPr>
+        <w:t xml:space="preserve"> · </w:t>
+      </w:r>
+      <w:hyperlink r:id="rId25">
+        <w:r>
+          <w:rPr>
+            <w:color w:val="1A5F9E"/>
+            <w:u w:val="single"/>
+            <w:sz w:val="22"/>
+            <w:rFonts w:ascii="Calibri" w:hAnsi="Calibri" w:eastAsia="WenQuanYi Micro Hei"/>
+          </w:rPr>
+          <w:t xml:space="preserve">PubMed 30632505</w:t>
+        </w:r>
+      </w:hyperlink>
+      <w:r>
+        <w:rPr>
+          <w:rFonts w:ascii="Calibri" w:hAnsi="Calibri" w:eastAsia="WenQuanYi Micro Hei" w:cs="Calibri"/>
+          <w:b w:val="0"/>
+          <w:i w:val="0"/>
+          <w:color w:val="222222"/>
+          <w:sz w:val="22"/>
+        </w:rPr>
+        <w:t xml:space="preserve"> · </w:t>
+      </w:r>
+      <w:hyperlink r:id="rId14">
+        <w:r>
+          <w:rPr>
+            <w:color w:val="1A5F9E"/>
+            <w:u w:val="single"/>
+            <w:sz w:val="22"/>
+            <w:rFonts w:ascii="Calibri" w:hAnsi="Calibri" w:eastAsia="WenQuanYi Micro Hei"/>
+          </w:rPr>
+          <w:t xml:space="preserve">中国期刊页</w:t>
+        </w:r>
+      </w:hyperlink>
+      <w:r>
+        <w:rPr>
+          <w:rFonts w:ascii="Calibri" w:hAnsi="Calibri" w:eastAsia="WenQuanYi Micro Hei" w:cs="Calibri"/>
+          <w:b w:val="0"/>
+          <w:i w:val="0"/>
+          <w:color w:val="222222"/>
+          <w:sz w:val="22"/>
+        </w:rPr>
+        <w:t xml:space="preserve"> 单位：内蒙古医科大学等。 期刊：在中国主办、国内外发行的神经再生类期刊（沈阳《神经再生研究》杂志社）。</w:t>
       </w:r>
     </w:p>
     <w:p>
@@ -1152,7 +3018,7 @@
       <w:r>
         <w:rPr>
           <w:rFonts w:ascii="Calibri" w:hAnsi="Calibri" w:eastAsia="WenQuanYi Micro Hei" w:cs="Calibri"/>
-          <w:b w:val="0"/>
+          <w:b/>
           <w:i w:val="0"/>
           <w:color w:val="222222"/>
           <w:sz w:val="22"/>
@@ -1231,7 +3097,7 @@
       <w:r>
         <w:rPr>
           <w:rFonts w:ascii="Calibri" w:hAnsi="Calibri" w:eastAsia="WenQuanYi Micro Hei" w:cs="Calibri"/>
-          <w:b w:val="0"/>
+          <w:b/>
           <w:i w:val="0"/>
           <w:color w:val="222222"/>
           <w:sz w:val="22"/>
@@ -1252,7 +3118,27 @@
           <w:color w:val="222222"/>
           <w:sz w:val="22"/>
         </w:rPr>
-        <w:t>•  **保护链条是 AR → 抗氧化 → 突触可塑性 → 认知**，四步都被氟他胺切断，因果链比较完整。</w:t>
+        <w:t xml:space="preserve">•  </w:t>
+      </w:r>
+      <w:r>
+        <w:rPr>
+          <w:rFonts w:ascii="Calibri" w:hAnsi="Calibri" w:eastAsia="WenQuanYi Micro Hei" w:cs="Calibri"/>
+          <w:b/>
+          <w:i w:val="0"/>
+          <w:color w:val="222222"/>
+          <w:sz w:val="22"/>
+        </w:rPr>
+        <w:t>保护链条是 AR → 抗氧化 → 突触可塑性 → 认知</w:t>
+      </w:r>
+      <w:r>
+        <w:rPr>
+          <w:rFonts w:ascii="Calibri" w:hAnsi="Calibri" w:eastAsia="WenQuanYi Micro Hei" w:cs="Calibri"/>
+          <w:b w:val="0"/>
+          <w:i w:val="0"/>
+          <w:color w:val="222222"/>
+          <w:sz w:val="22"/>
+        </w:rPr>
+        <w:t>，四步都被氟他胺切断，因果链比较完整。</w:t>
       </w:r>
     </w:p>
     <w:p>
@@ -1268,7 +3154,27 @@
           <w:color w:val="222222"/>
           <w:sz w:val="22"/>
         </w:rPr>
-        <w:t>•  **对象虽是 AD 模型，终点全是慢性损伤共用的海马指标**（棘突、PSD95、锥体细胞），可迁移到慢性应激讨论。</w:t>
+        <w:t xml:space="preserve">•  </w:t>
+      </w:r>
+      <w:r>
+        <w:rPr>
+          <w:rFonts w:ascii="Calibri" w:hAnsi="Calibri" w:eastAsia="WenQuanYi Micro Hei" w:cs="Calibri"/>
+          <w:b/>
+          <w:i w:val="0"/>
+          <w:color w:val="222222"/>
+          <w:sz w:val="22"/>
+        </w:rPr>
+        <w:t>对象虽是 AD 模型，终点全是慢性损伤共用的海马指标</w:t>
+      </w:r>
+      <w:r>
+        <w:rPr>
+          <w:rFonts w:ascii="Calibri" w:hAnsi="Calibri" w:eastAsia="WenQuanYi Micro Hei" w:cs="Calibri"/>
+          <w:b w:val="0"/>
+          <w:i w:val="0"/>
+          <w:color w:val="222222"/>
+          <w:sz w:val="22"/>
+        </w:rPr>
+        <w:t>（棘突、PSD95、锥体细胞），可迁移到慢性应激讨论。</w:t>
       </w:r>
     </w:p>
     <w:p>
@@ -1284,7 +3190,27 @@
           <w:color w:val="222222"/>
           <w:sz w:val="22"/>
         </w:rPr>
-        <w:t>•  **行为—形态—生化三项同向**，不是单一替代指标。</w:t>
+        <w:t xml:space="preserve">•  </w:t>
+      </w:r>
+      <w:r>
+        <w:rPr>
+          <w:rFonts w:ascii="Calibri" w:hAnsi="Calibri" w:eastAsia="WenQuanYi Micro Hei" w:cs="Calibri"/>
+          <w:b/>
+          <w:i w:val="0"/>
+          <w:color w:val="222222"/>
+          <w:sz w:val="22"/>
+        </w:rPr>
+        <w:t>行为—形态—生化三项同向</w:t>
+      </w:r>
+      <w:r>
+        <w:rPr>
+          <w:rFonts w:ascii="Calibri" w:hAnsi="Calibri" w:eastAsia="WenQuanYi Micro Hei" w:cs="Calibri"/>
+          <w:b w:val="0"/>
+          <w:i w:val="0"/>
+          <w:color w:val="222222"/>
+          <w:sz w:val="22"/>
+        </w:rPr>
+        <w:t>，不是单一替代指标。</w:t>
       </w:r>
     </w:p>
     <w:p>
@@ -1300,7 +3226,27 @@
           <w:color w:val="222222"/>
           <w:sz w:val="22"/>
         </w:rPr>
-        <w:t>•  **局限**：不是 CUMS 原模型，外推到职业压力要降一档把握。</w:t>
+        <w:t xml:space="preserve">•  </w:t>
+      </w:r>
+      <w:r>
+        <w:rPr>
+          <w:rFonts w:ascii="Calibri" w:hAnsi="Calibri" w:eastAsia="WenQuanYi Micro Hei" w:cs="Calibri"/>
+          <w:b/>
+          <w:i w:val="0"/>
+          <w:color w:val="222222"/>
+          <w:sz w:val="22"/>
+        </w:rPr>
+        <w:t>局限</w:t>
+      </w:r>
+      <w:r>
+        <w:rPr>
+          <w:rFonts w:ascii="Calibri" w:hAnsi="Calibri" w:eastAsia="WenQuanYi Micro Hei" w:cs="Calibri"/>
+          <w:b w:val="0"/>
+          <w:i w:val="0"/>
+          <w:color w:val="222222"/>
+          <w:sz w:val="22"/>
+        </w:rPr>
+        <w:t>：不是 CUMS 原模型，外推到职业压力要降一档把握。</w:t>
       </w:r>
     </w:p>
     <w:p>
@@ -1310,12 +3256,22 @@
       <w:r>
         <w:rPr>
           <w:rFonts w:ascii="Calibri" w:hAnsi="Calibri" w:eastAsia="WenQuanYi Micro Hei" w:cs="Calibri"/>
+          <w:b/>
+          <w:i w:val="0"/>
+          <w:color w:val="222222"/>
+          <w:sz w:val="22"/>
+        </w:rPr>
+        <w:t>主要结论（论点）</w:t>
+      </w:r>
+      <w:r>
+        <w:rPr>
+          <w:rFonts w:ascii="Calibri" w:hAnsi="Calibri" w:eastAsia="WenQuanYi Micro Hei" w:cs="Calibri"/>
           <w:b w:val="0"/>
           <w:i w:val="0"/>
           <w:color w:val="222222"/>
           <w:sz w:val="22"/>
         </w:rPr>
-        <w:t>主要结论（论点） 睾酮经雄激素受体清除自由基、增强海马突触可塑性，从而保护认知；AR 是这条抗氧化保护轴的必要节点。</w:t>
+        <w:t xml:space="preserve"> 睾酮经雄激素受体清除自由基、增强海马突触可塑性，从而保护认知；AR 是这条抗氧化保护轴的必要节点。</w:t>
       </w:r>
     </w:p>
     <w:p>
@@ -1330,7 +3286,7 @@
           <w:color w:val="1F3A5F"/>
           <w:sz w:val="32"/>
         </w:rPr>
-        <w:t>大陆境内论文 2</w:t>
+        <w:t>大陆境内论文 2（【Cursor网搜，非截图他源】）</w:t>
       </w:r>
     </w:p>
     <w:p>
@@ -1340,12 +3296,103 @@
       <w:r>
         <w:rPr>
           <w:rFonts w:ascii="Calibri" w:hAnsi="Calibri" w:eastAsia="WenQuanYi Micro Hei" w:cs="Calibri"/>
+          <w:b/>
+          <w:i w:val="0"/>
+          <w:color w:val="222222"/>
+          <w:sz w:val="22"/>
+        </w:rPr>
+        <w:t>出处</w:t>
+      </w:r>
+      <w:r>
+        <w:rPr>
+          <w:rFonts w:ascii="Calibri" w:hAnsi="Calibri" w:eastAsia="WenQuanYi Micro Hei" w:cs="Calibri"/>
           <w:b w:val="0"/>
           <w:i w:val="0"/>
           <w:color w:val="222222"/>
           <w:sz w:val="22"/>
         </w:rPr>
-        <w:t>出处 崔慧先, 解国圣, 李莎, 石葛明, 顾平, 杜鹃, 蔡志平, 李楠. 双氢睾酮对快速老化小鼠海马 CA1 区突触可塑性和 N-甲基-D-天冬氨酸受体 1 的影响. *解剖学报*. 2010;41(6)：对应栏目页码见该期（DOI：10.3969/j.issn.0529-1356.2010.06.006）。 单位：河北医科大学解剖学教研室等。 期刊：中国解剖学会主办，国内解剖学权威期刊。</w:t>
+        <w:t xml:space="preserve"> 崔慧先, 解国圣, 李莎, 石葛明, 顾平, 杜鹃, 蔡志平, 李楠. 双氢睾酮对快速老化小鼠海马 CA1 区突触可塑性和 N-甲基-D-天冬氨酸受体 1 的影响. *解剖学报*. 2010;41(6). </w:t>
+      </w:r>
+      <w:r>
+        <w:rPr>
+          <w:rFonts w:ascii="Calibri" w:hAnsi="Calibri" w:eastAsia="WenQuanYi Micro Hei" w:cs="Calibri"/>
+          <w:b/>
+          <w:i w:val="0"/>
+          <w:color w:val="222222"/>
+          <w:sz w:val="22"/>
+        </w:rPr>
+        <w:t>来源标注：</w:t>
+      </w:r>
+      <w:r>
+        <w:rPr>
+          <w:rFonts w:ascii="Calibri" w:hAnsi="Calibri" w:eastAsia="WenQuanYi Micro Hei" w:cs="Calibri"/>
+          <w:b w:val="0"/>
+          <w:i w:val="0"/>
+          <w:color w:val="222222"/>
+          <w:sz w:val="22"/>
+        </w:rPr>
+        <w:t>【Cursor网搜，非截图他源】用户提问要求“境内 2 篇”，但截图和提问</w:t>
+      </w:r>
+      <w:r>
+        <w:rPr>
+          <w:rFonts w:ascii="Calibri" w:hAnsi="Calibri" w:eastAsia="WenQuanYi Micro Hei" w:cs="Calibri"/>
+          <w:b/>
+          <w:i w:val="0"/>
+          <w:color w:val="222222"/>
+          <w:sz w:val="22"/>
+        </w:rPr>
+        <w:t>都没有写出崔慧先或《解剖学报》</w:t>
+      </w:r>
+      <w:r>
+        <w:rPr>
+          <w:rFonts w:ascii="Calibri" w:hAnsi="Calibri" w:eastAsia="WenQuanYi Micro Hei" w:cs="Calibri"/>
+          <w:b w:val="0"/>
+          <w:i w:val="0"/>
+          <w:color w:val="222222"/>
+          <w:sz w:val="22"/>
+        </w:rPr>
+        <w:t xml:space="preserve">。本篇由 Cursor 网搜补入，用来覆盖“DHT 不经芳香化也能改 CA1 树突棘”这一条。 </w:t>
+      </w:r>
+      <w:r>
+        <w:rPr>
+          <w:rFonts w:ascii="Calibri" w:hAnsi="Calibri" w:eastAsia="WenQuanYi Micro Hei" w:cs="Calibri"/>
+          <w:b/>
+          <w:i w:val="0"/>
+          <w:color w:val="222222"/>
+          <w:sz w:val="22"/>
+        </w:rPr>
+        <w:t>超链接：</w:t>
+      </w:r>
+      <w:r>
+        <w:rPr>
+          <w:rFonts w:ascii="Calibri" w:hAnsi="Calibri" w:eastAsia="WenQuanYi Micro Hei" w:cs="Calibri"/>
+          <w:b w:val="0"/>
+          <w:i w:val="0"/>
+          <w:color w:val="222222"/>
+          <w:sz w:val="22"/>
+        </w:rPr>
+        <w:t xml:space="preserve"> </w:t>
+      </w:r>
+      <w:hyperlink r:id="rId15">
+        <w:r>
+          <w:rPr>
+            <w:color w:val="1A5F9E"/>
+            <w:u w:val="single"/>
+            <w:sz w:val="22"/>
+            <w:rFonts w:ascii="Calibri" w:hAnsi="Calibri" w:eastAsia="WenQuanYi Micro Hei"/>
+          </w:rPr>
+          <w:t xml:space="preserve">DOI 10.3969/j.issn.0529-1356.2010.06.006</w:t>
+        </w:r>
+      </w:hyperlink>
+      <w:r>
+        <w:rPr>
+          <w:rFonts w:ascii="Calibri" w:hAnsi="Calibri" w:eastAsia="WenQuanYi Micro Hei" w:cs="Calibri"/>
+          <w:b w:val="0"/>
+          <w:i w:val="0"/>
+          <w:color w:val="222222"/>
+          <w:sz w:val="22"/>
+        </w:rPr>
+        <w:t xml:space="preserve"> 单位：河北医科大学解剖学教研室等。 期刊：中国解剖学会主办，国内解剖学权威期刊。</w:t>
       </w:r>
     </w:p>
     <w:p>
@@ -1355,7 +3402,7 @@
       <w:r>
         <w:rPr>
           <w:rFonts w:ascii="Calibri" w:hAnsi="Calibri" w:eastAsia="WenQuanYi Micro Hei" w:cs="Calibri"/>
-          <w:b w:val="0"/>
+          <w:b/>
           <w:i w:val="0"/>
           <w:color w:val="222222"/>
           <w:sz w:val="22"/>
@@ -1434,7 +3481,7 @@
       <w:r>
         <w:rPr>
           <w:rFonts w:ascii="Calibri" w:hAnsi="Calibri" w:eastAsia="WenQuanYi Micro Hei" w:cs="Calibri"/>
-          <w:b w:val="0"/>
+          <w:b/>
           <w:i w:val="0"/>
           <w:color w:val="222222"/>
           <w:sz w:val="22"/>
@@ -1455,7 +3502,27 @@
           <w:color w:val="222222"/>
           <w:sz w:val="22"/>
         </w:rPr>
-        <w:t>•  **把保护落到 CA1 突触的可计数结构上**，不只是迷宫秒数。</w:t>
+        <w:t xml:space="preserve">•  </w:t>
+      </w:r>
+      <w:r>
+        <w:rPr>
+          <w:rFonts w:ascii="Calibri" w:hAnsi="Calibri" w:eastAsia="WenQuanYi Micro Hei" w:cs="Calibri"/>
+          <w:b/>
+          <w:i w:val="0"/>
+          <w:color w:val="222222"/>
+          <w:sz w:val="22"/>
+        </w:rPr>
+        <w:t>把保护落到 CA1 突触的可计数结构上</w:t>
+      </w:r>
+      <w:r>
+        <w:rPr>
+          <w:rFonts w:ascii="Calibri" w:hAnsi="Calibri" w:eastAsia="WenQuanYi Micro Hei" w:cs="Calibri"/>
+          <w:b w:val="0"/>
+          <w:i w:val="0"/>
+          <w:color w:val="222222"/>
+          <w:sz w:val="22"/>
+        </w:rPr>
+        <w:t>，不只是迷宫秒数。</w:t>
       </w:r>
     </w:p>
     <w:p>
@@ -1471,7 +3538,27 @@
           <w:color w:val="222222"/>
           <w:sz w:val="22"/>
         </w:rPr>
-        <w:t>•  **NMDAR1 被一起调回来**：提示雄激素影响的是可塑性和兴奋性传递的装置，而不只是细胞“活着”。</w:t>
+        <w:t xml:space="preserve">•  </w:t>
+      </w:r>
+      <w:r>
+        <w:rPr>
+          <w:rFonts w:ascii="Calibri" w:hAnsi="Calibri" w:eastAsia="WenQuanYi Micro Hei" w:cs="Calibri"/>
+          <w:b/>
+          <w:i w:val="0"/>
+          <w:color w:val="222222"/>
+          <w:sz w:val="22"/>
+        </w:rPr>
+        <w:t>NMDAR1 被一起调回来</w:t>
+      </w:r>
+      <w:r>
+        <w:rPr>
+          <w:rFonts w:ascii="Calibri" w:hAnsi="Calibri" w:eastAsia="WenQuanYi Micro Hei" w:cs="Calibri"/>
+          <w:b w:val="0"/>
+          <w:i w:val="0"/>
+          <w:color w:val="222222"/>
+          <w:sz w:val="22"/>
+        </w:rPr>
+        <w:t>：提示雄激素影响的是可塑性和兴奋性传递的装置，而不只是细胞“活着”。</w:t>
       </w:r>
     </w:p>
     <w:p>
@@ -1487,7 +3574,27 @@
           <w:color w:val="222222"/>
           <w:sz w:val="22"/>
         </w:rPr>
-        <w:t>•  **DHT 不能芳香化成雌二醇**，强化“雄激素受体路径足够改变突触”。</w:t>
+        <w:t xml:space="preserve">•  </w:t>
+      </w:r>
+      <w:r>
+        <w:rPr>
+          <w:rFonts w:ascii="Calibri" w:hAnsi="Calibri" w:eastAsia="WenQuanYi Micro Hei" w:cs="Calibri"/>
+          <w:b/>
+          <w:i w:val="0"/>
+          <w:color w:val="222222"/>
+          <w:sz w:val="22"/>
+        </w:rPr>
+        <w:t>DHT 不能芳香化成雌二醇</w:t>
+      </w:r>
+      <w:r>
+        <w:rPr>
+          <w:rFonts w:ascii="Calibri" w:hAnsi="Calibri" w:eastAsia="WenQuanYi Micro Hei" w:cs="Calibri"/>
+          <w:b w:val="0"/>
+          <w:i w:val="0"/>
+          <w:color w:val="222222"/>
+          <w:sz w:val="22"/>
+        </w:rPr>
+        <w:t>，强化“雄激素受体路径足够改变突触”。</w:t>
       </w:r>
     </w:p>
     <w:p>
@@ -1503,7 +3610,27 @@
           <w:color w:val="222222"/>
           <w:sz w:val="22"/>
         </w:rPr>
-        <w:t>•  **快速老化鼠 ≈ 雄激素下降 + 海马易损**：和中年男性高皮质醇窗口有概念上的重叠。</w:t>
+        <w:t xml:space="preserve">•  </w:t>
+      </w:r>
+      <w:r>
+        <w:rPr>
+          <w:rFonts w:ascii="Calibri" w:hAnsi="Calibri" w:eastAsia="WenQuanYi Micro Hei" w:cs="Calibri"/>
+          <w:b/>
+          <w:i w:val="0"/>
+          <w:color w:val="222222"/>
+          <w:sz w:val="22"/>
+        </w:rPr>
+        <w:t>快速老化鼠 ≈ 雄激素下降 + 海马易损</w:t>
+      </w:r>
+      <w:r>
+        <w:rPr>
+          <w:rFonts w:ascii="Calibri" w:hAnsi="Calibri" w:eastAsia="WenQuanYi Micro Hei" w:cs="Calibri"/>
+          <w:b w:val="0"/>
+          <w:i w:val="0"/>
+          <w:color w:val="222222"/>
+          <w:sz w:val="22"/>
+        </w:rPr>
+        <w:t>：和中年男性高皮质醇窗口有概念上的重叠。</w:t>
       </w:r>
     </w:p>
     <w:p>
@@ -1513,12 +3640,22 @@
       <w:r>
         <w:rPr>
           <w:rFonts w:ascii="Calibri" w:hAnsi="Calibri" w:eastAsia="WenQuanYi Micro Hei" w:cs="Calibri"/>
+          <w:b/>
+          <w:i w:val="0"/>
+          <w:color w:val="222222"/>
+          <w:sz w:val="22"/>
+        </w:rPr>
+        <w:t>主要结论（论点）</w:t>
+      </w:r>
+      <w:r>
+        <w:rPr>
+          <w:rFonts w:ascii="Calibri" w:hAnsi="Calibri" w:eastAsia="WenQuanYi Micro Hei" w:cs="Calibri"/>
           <w:b w:val="0"/>
           <w:i w:val="0"/>
           <w:color w:val="222222"/>
           <w:sz w:val="22"/>
         </w:rPr>
-        <w:t>主要结论（论点） DHT 可恢复去势后海马 CA1 树突棘、突触素和 NMDAR1，说明雄激素对突触可塑性的结构保护可以不经过转化成雌二醇。</w:t>
+        <w:t xml:space="preserve"> DHT 可恢复去势后海马 CA1 树突棘、突触素和 NMDAR1，说明雄激素对突触可塑性的结构保护可以不经过转化成雌二醇。</w:t>
       </w:r>
     </w:p>
     <w:p>
@@ -1549,7 +3686,17 @@
           <w:color w:val="222222"/>
           <w:sz w:val="22"/>
         </w:rPr>
-        <w:t>•  **原理分成“少受伤”和“多修补”两块。**</w:t>
+        <w:t xml:space="preserve">•  </w:t>
+      </w:r>
+      <w:r>
+        <w:rPr>
+          <w:rFonts w:ascii="Calibri" w:hAnsi="Calibri" w:eastAsia="WenQuanYi Micro Hei" w:cs="Calibri"/>
+          <w:b/>
+          <w:i w:val="0"/>
+          <w:color w:val="222222"/>
+          <w:sz w:val="22"/>
+        </w:rPr>
+        <w:t>原理分成“少受伤”和“多修补”两块。</w:t>
       </w:r>
     </w:p>
     <w:p>
@@ -1580,7 +3727,27 @@
           <w:color w:val="222222"/>
           <w:sz w:val="22"/>
         </w:rPr>
-        <w:t>•  **所以男性在 Savic 2020 里化学改变更轻，说得通，但不是证明。** 该文没有测睾酮；合理的桥是：更高的雄激素背景 → 较低的 HPA 峰值和较低的前额叶谷氨酸负荷。</w:t>
+        <w:t xml:space="preserve">•  </w:t>
+      </w:r>
+      <w:r>
+        <w:rPr>
+          <w:rFonts w:ascii="Calibri" w:hAnsi="Calibri" w:eastAsia="WenQuanYi Micro Hei" w:cs="Calibri"/>
+          <w:b/>
+          <w:i w:val="0"/>
+          <w:color w:val="222222"/>
+          <w:sz w:val="22"/>
+        </w:rPr>
+        <w:t>所以男性在 Savic 2020 里化学改变更轻，说得通，但不是证明。</w:t>
+      </w:r>
+      <w:r>
+        <w:rPr>
+          <w:rFonts w:ascii="Calibri" w:hAnsi="Calibri" w:eastAsia="WenQuanYi Micro Hei" w:cs="Calibri"/>
+          <w:b w:val="0"/>
+          <w:i w:val="0"/>
+          <w:color w:val="222222"/>
+          <w:sz w:val="22"/>
+        </w:rPr>
+        <w:t xml:space="preserve"> 该文没有测睾酮；合理的桥是：更高的雄激素背景 → 较低的 HPA 峰值和较低的前额叶谷氨酸负荷。</w:t>
       </w:r>
     </w:p>
     <w:p>
@@ -1596,7 +3763,27 @@
           <w:color w:val="222222"/>
           <w:sz w:val="22"/>
         </w:rPr>
-        <w:t>•  **保护是有环境条件的。** 高皮质醇时睾酮像保险；低皮质醇时同样高的睾酮不一定加分。这和“看环境合不合适”是同一逻辑。</w:t>
+        <w:t xml:space="preserve">•  </w:t>
+      </w:r>
+      <w:r>
+        <w:rPr>
+          <w:rFonts w:ascii="Calibri" w:hAnsi="Calibri" w:eastAsia="WenQuanYi Micro Hei" w:cs="Calibri"/>
+          <w:b/>
+          <w:i w:val="0"/>
+          <w:color w:val="222222"/>
+          <w:sz w:val="22"/>
+        </w:rPr>
+        <w:t>保护是有环境条件的。</w:t>
+      </w:r>
+      <w:r>
+        <w:rPr>
+          <w:rFonts w:ascii="Calibri" w:hAnsi="Calibri" w:eastAsia="WenQuanYi Micro Hei" w:cs="Calibri"/>
+          <w:b w:val="0"/>
+          <w:i w:val="0"/>
+          <w:color w:val="222222"/>
+          <w:sz w:val="22"/>
+        </w:rPr>
+        <w:t xml:space="preserve"> 高皮质醇时睾酮像保险；低皮质醇时同样高的睾酮不一定加分。这和“看环境合不合适”是同一逻辑。</w:t>
       </w:r>
     </w:p>
     <w:p>
@@ -1612,7 +3799,47 @@
           <w:color w:val="222222"/>
           <w:sz w:val="22"/>
         </w:rPr>
-        <w:t>•  **不等于临床建议补睾酮。** 上列多为动物或观察性人数据，剂量、前列腺、红细胞、情绪激惹等风险不在本笔记展开。这里只回答机制：它主要在**压力激素过高的窗口**里，帮海马和 HPA 把音量拧回去。</w:t>
+        <w:t xml:space="preserve">•  </w:t>
+      </w:r>
+      <w:r>
+        <w:rPr>
+          <w:rFonts w:ascii="Calibri" w:hAnsi="Calibri" w:eastAsia="WenQuanYi Micro Hei" w:cs="Calibri"/>
+          <w:b/>
+          <w:i w:val="0"/>
+          <w:color w:val="222222"/>
+          <w:sz w:val="22"/>
+        </w:rPr>
+        <w:t>不等于临床建议补睾酮。</w:t>
+      </w:r>
+      <w:r>
+        <w:rPr>
+          <w:rFonts w:ascii="Calibri" w:hAnsi="Calibri" w:eastAsia="WenQuanYi Micro Hei" w:cs="Calibri"/>
+          <w:b w:val="0"/>
+          <w:i w:val="0"/>
+          <w:color w:val="222222"/>
+          <w:sz w:val="22"/>
+        </w:rPr>
+        <w:t xml:space="preserve"> 上列多为动物或观察性人数据，剂量、前列腺、红细胞、情绪激惹等风险不在本笔记展开。这里只回答机制：它主要在</w:t>
+      </w:r>
+      <w:r>
+        <w:rPr>
+          <w:rFonts w:ascii="Calibri" w:hAnsi="Calibri" w:eastAsia="WenQuanYi Micro Hei" w:cs="Calibri"/>
+          <w:b/>
+          <w:i w:val="0"/>
+          <w:color w:val="222222"/>
+          <w:sz w:val="22"/>
+        </w:rPr>
+        <w:t>压力激素过高的窗口</w:t>
+      </w:r>
+      <w:r>
+        <w:rPr>
+          <w:rFonts w:ascii="Calibri" w:hAnsi="Calibri" w:eastAsia="WenQuanYi Micro Hei" w:cs="Calibri"/>
+          <w:b w:val="0"/>
+          <w:i w:val="0"/>
+          <w:color w:val="222222"/>
+          <w:sz w:val="22"/>
+        </w:rPr>
+        <w:t>里，帮海马和 HPA 把音量拧回去。</w:t>
       </w:r>
     </w:p>
     <w:sectPr>

</xml_diff>